<commit_message>
docs(academic): update thesis proposal with verified results, APA references and editorial guidelines
</commit_message>
<xml_diff>
--- a/Propuesta-grado/Propuesta_de_Grado_MSPI.docx
+++ b/Propuesta-grado/Propuesta_de_Grado_MSPI.docx
@@ -11,15 +11,13 @@
           <w:bCs/>
         </w:rPr>
       </w:pPr>
-      <w:commentRangeStart w:id="0"/>
-      <w:commentRangeEnd w:id="0"/>
       <w:r>
         <w:rPr>
           <w:rFonts w:cs="Times New Roman"/>
           <w:b/>
           <w:bCs/>
         </w:rPr>
-        <w:t>MSPI: sistema de gestion de seguridad y privacidad de la informacion basado en ISO/IEC 27001, implementado mediante una plataforma de microservicios y microfrontends</w:t>
+        <w:t xml:space="preserve">MSPI: sistema de gestión de seguridad y privacidad de la información basado en ISO/IEC 27001, implementado mediante una plataforma de microservicios y microfrontends</w:t>
       </w:r>
     </w:p>
     <w:p>
@@ -59,7 +57,6 @@
           <w:rFonts w:cs="Times New Roman"/>
         </w:rPr>
       </w:pPr>
-      <w:commentRangeStart w:id="1"/>
       <w:r>
         <w:rPr>
           <w:rFonts w:cs="Times New Roman"/>
@@ -74,7 +71,6 @@
           <w:rFonts w:cs="Times New Roman"/>
         </w:rPr>
       </w:pPr>
-      <w:commentRangeEnd w:id="1"/>
       <w:r>
         <w:rPr>
           <w:rFonts w:cs="Times New Roman"/>
@@ -139,7 +135,7 @@
         <w:rPr>
           <w:rFonts w:cs="Times New Roman"/>
         </w:rPr>
-        <w:t>[PENDIENTE: nombre del director(a) o asesor(a) asignado por el programa]</w:t>
+        <w:t xml:space="preserve">Director: Ing. Luis Ángel Vargas Narvaez</w:t>
       </w:r>
     </w:p>
     <w:p>
@@ -257,7 +253,7 @@
           <w:b/>
           <w:bCs/>
         </w:rPr>
-        <w:t>[PENDIENTE: nombre de la facultad]</w:t>
+        <w:t xml:space="preserve">Facultad de Ingeniería</w:t>
       </w:r>
     </w:p>
     <w:p>
@@ -365,23 +361,13 @@
                 <w:bCs w:val="0"/>
               </w:rPr>
             </w:pPr>
-            <w:commentRangeStart w:id="2"/>
             <w:r>
               <w:rPr>
                 <w:rFonts w:cs="Times New Roman"/>
                 <w:b w:val="0"/>
                 <w:bCs w:val="0"/>
               </w:rPr>
-              <w:t>(Apellido, año)</w:t>
-            </w:r>
-            <w:commentRangeEnd w:id="2"/>
-            <w:r>
-              <w:rPr>
-                <w:rStyle w:val="Refdecomentario"/>
-                <w:b w:val="0"/>
-                <w:bCs w:val="0"/>
-              </w:rPr>
-              <w:commentReference w:id="2"/>
+              <w:t xml:space="preserve">(Suarez Camacho &amp; Tovar Rodriguez, 2026)</w:t>
             </w:r>
           </w:p>
         </w:tc>
@@ -427,33 +413,7 @@
               <w:rPr>
                 <w:rFonts w:cs="Times New Roman"/>
               </w:rPr>
-              <w:t xml:space="preserve">Apellido, N. N. (Año). </w:t>
-            </w:r>
-            <w:r>
-              <w:rPr>
-                <w:rFonts w:cs="Times New Roman"/>
-                <w:i/>
-                <w:iCs/>
-              </w:rPr>
-              <w:t xml:space="preserve">Título de la tesis en cursiva </w:t>
-            </w:r>
-            <w:r>
-              <w:rPr>
-                <w:rFonts w:cs="Times New Roman"/>
-              </w:rPr>
-              <w:t>[Tesis de pregrado/maestría/</w:t>
-            </w:r>
-            <w:r>
-              <w:rPr>
-                <w:rFonts w:cs="Times New Roman"/>
-              </w:rPr>
-              <w:t>especialización/</w:t>
-            </w:r>
-            <w:r>
-              <w:rPr>
-                <w:rFonts w:cs="Times New Roman"/>
-              </w:rPr>
-              <w:t xml:space="preserve"> doctorado]. Nombre de la institución. URL</w:t>
+              <w:t xml:space="preserve">Suarez Camacho, B. A., &amp; Tovar Rodriguez, J. D. (2026). MSPI: sistema de gestión de seguridad y privacidad de la información basado en ISO/IEC 27001, implementado mediante una plataforma de microservicios y microfrontends [Propuesta de proyecto de grado de pregrado]. Corporación Universitaria del Huila – CORHUILA.</w:t>
             </w:r>
           </w:p>
         </w:tc>
@@ -493,7 +453,6 @@
           <w:lang w:eastAsia="es-CO"/>
         </w:rPr>
       </w:pPr>
-      <w:commentRangeStart w:id="3"/>
       <w:r>
         <w:rPr>
           <w:rFonts w:cs="Times New Roman"/>
@@ -546,13 +505,6 @@
             </a:graphic>
           </wp:inline>
         </w:drawing>
-      </w:r>
-      <w:commentRangeEnd w:id="3"/>
-      <w:r>
-        <w:rPr>
-          <w:rStyle w:val="Refdecomentario"/>
-        </w:rPr>
-        <w:commentReference w:id="3"/>
       </w:r>
       <w:r>
         <w:rPr>
@@ -1306,26 +1258,17 @@
       <w:pPr>
         <w:jc w:val="center"/>
         <w:rPr>
-          <w:rFonts w:cs="Times New Roman"/>
           <w:b/>
           <w:bCs/>
         </w:rPr>
       </w:pPr>
-      <w:commentRangeStart w:id="5"/>
-      <w:r>
-        <w:rPr>
-          <w:rFonts w:cs="Times New Roman"/>
+      <w:r>
+        <w:rPr>
           <w:b/>
           <w:bCs/>
         </w:rPr>
-        <w:t>Dedicatoria</w:t>
-      </w:r>
-      <w:commentRangeEnd w:id="5"/>
-      <w:r>
-        <w:rPr>
-          <w:rStyle w:val="Refdecomentario"/>
-        </w:rPr>
-        <w:commentReference w:id="5"/>
+        <w:lastRenderedPageBreak/>
+        <w:t>Resumen y palabras claves</w:t>
       </w:r>
     </w:p>
     <w:p>
@@ -1334,116 +1277,92 @@
         <w:jc w:val="both"/>
       </w:pPr>
       <w:r>
+        <w:t xml:space="preserve">Las entidades públicas colombianas deben evaluar periódicamente su nivel de madurez en seguridad de la información con base en el Instrumento de Identificación de la Línea Base de Seguridad del Modelo de Seguridad y Privacidad de la Información (MSPI) de MinTIC, fundamentado en el Anexo A de ISO/IEC 27001, el ciclo PHVA (Planificar-Hacer-Verificar-Actuar) y el marco NIST CSF 2.0. Actualmente este instrumento se diligencia de forma manual en una hoja de cálculo de nueve hojas, lo que genera errores de cálculo, ausencia de trazabilidad de evidencias, falta de control de acceso diferenciado y nula comparabilidad histórica entre evaluaciones. Este proyecto de grado presenta el diseño y la implementación de MSPI, una plataforma de software basada en arquitectura de microservicios (backend en Java/Spring Boot con arquitectura hexagonal) y microfrontends (frontend en Angular), que automatiza el instrumento completo: levantamiento de información, asignación de áreas y responsables, calificación de controles administrativos y técnicos del Anexo A, cálculo ponderado del avance PHVA, determinación del nivel de madurez del SGSI, evaluación frente a NIST CSF, gestión de evidencias documentales, identidad y control de acceso basado en roles, y generación de reportes. El sistema se compone de ocho microservicios (ms_iam, ms_org, ms_catalog, ms_assessment, ms_evidence, ms_reporting, ms_audit y ms_admin) y seis microfrontends (mf_shell, mf_auth, mf_org, mf_assessment, mf_evidence y mf_reports), desplegados con Docker y respaldados por PostgreSQL y Keycloak. La metodología de desarrollo siguió un enfoque ágil iterativo-incremental organizado en ocho sprints, y la investigación se sitúa en el tipo aplicado o tecnológico, con un enfoque predominantemente cualitativo (análisis del proceso manual existente y diseño de la solución) complementado con verificación cuantitativa de las fórmulas de cálculo del instrumento. Entre los principales resultados se destaca la implementación funcional de los ocho microservicios (156 servicios REST sobre un modelo de 73 tablas) y de los seis microfrontends, con auditoría centralizada, solicitudes aprobables con radicado y borrado lógico, así como la identificación de limitaciones para el trabajo futuro, entre ellas la cobertura de pruebas automatizadas heterogénea entre backend y frontend y la preparación del frontend para un despliegue productivo. El proyecto demuestra la viabilidad técnica de digitalizar un instrumento regulatorio de seguridad de la información colombiano mediante una arquitectura moderna, distribuida y trazable, sentando una base reutilizable para futuras entidades públicas que deban adoptar el modelo MSPI.</w:t>
+      </w:r>
+    </w:p>
+    <w:p>
+      <w:pPr>
+        <w:ind w:firstLine="709"/>
+        <w:jc w:val="both"/>
+      </w:pPr>
+      <w:r>
         <w:rPr>
           <w:i/>
         </w:rPr>
-        <w:t xml:space="preserve">[Opcional: los autores pueden incluir aquí una dedicatoria breve, en cursiva y alineada a la derecha.]</w:t>
+        <w:t xml:space="preserve">Palabras clave: ISO/IEC 27001, Modelo de Seguridad y Privacidad de la Información (MSPI), microservicios, microfrontends, gestión de seguridad de la información.</w:t>
       </w:r>
     </w:p>
     <w:p>
       <w:pPr>
         <w:jc w:val="center"/>
         <w:rPr>
-          <w:rFonts w:cs="Times New Roman"/>
           <w:b/>
           <w:bCs/>
         </w:rPr>
       </w:pPr>
       <w:r>
         <w:rPr>
+          <w:b/>
+        </w:rPr>
+        <w:t xml:space="preserve">Abstract and key words</w:t>
+      </w:r>
+    </w:p>
+    <w:p>
+      <w:pPr>
+        <w:ind w:firstLine="709"/>
+        <w:jc w:val="both"/>
+      </w:pPr>
+      <w:r>
+        <w:t xml:space="preserve">Colombian public entities are required to periodically assess their information security maturity level using the Security Baseline Identification Instrument of MinTIC's Information Security and Privacy Model (MSPI), grounded in Annex A of ISO/IEC 27001, the PDCA cycle (Plan-Do-Check-Act) and the NIST Cybersecurity Framework 2.0. This instrument is currently filled out manually in a nine-sheet spreadsheet, which leads to calculation errors, lack of evidence traceability, absence of role-based access control and no historical comparability between assessments. This undergraduate thesis presents the design and implementation of MSPI, a software platform based on a microservices architecture (Java/Spring Boot backend with hexagonal architecture) and micro-frontends (Angular frontend), that automates the full instrument: information gathering, area and responsible-party assignment, scoring of administrative and technical Annex A controls, weighted PDCA progress calculation, SGSI maturity level determination, NIST CSF evaluation, documentary evidence management, identity and role-based access control, and report generation. The system comprises eight microservices (ms_iam, ms_org, ms_catalog, ms_assessment, ms_evidence, ms_reporting, ms_audit and ms_admin) and six micro-frontends (mf_shell, mf_auth, mf_org, mf_assessment, mf_evidence and mf_reports), deployed with Docker and backed by PostgreSQL and Keycloak. The development approach followed an agile, iterative-incremental process organized in eight sprints, and the research is classified as applied/technological, predominantly qualitative, complemented with quantitative verification of the instrument's calculation formulas. Key results include the functional implementation of all eight microservices (156 REST endpoints over a 73-table data model) and all six micro-frontends, with centralized auditing, approval-based requests with tracking numbers and logical deletion, as well as the identification of limitations for future work, such as uneven automated test coverage between backend and frontend and preparing the frontend for production deployment. The project demonstrates the technical feasibility of digitizing a Colombian information-security regulatory instrument through a modern, distributed and traceable architecture, laying a reusable foundation for other public entities that must adopt the MSPI model.</w:t>
+      </w:r>
+    </w:p>
+    <w:p>
+      <w:pPr>
+        <w:ind w:firstLine="709"/>
+        <w:jc w:val="both"/>
+      </w:pPr>
+      <w:r>
+        <w:rPr>
+          <w:i/>
+        </w:rPr>
+        <w:t xml:space="preserve">Keywords: ISO/IEC 27001, Information Security and Privacy Model (MSPI), microservices, micro-frontends, information security management.</w:t>
+      </w:r>
+    </w:p>
+    <w:p>
+      <w:pPr>
+        <w:rPr>
           <w:rFonts w:cs="Times New Roman"/>
           <w:b/>
           <w:bCs/>
         </w:rPr>
-        <w:lastRenderedPageBreak/>
-        <w:t>Agradecimientos</w:t>
-      </w:r>
-    </w:p>
-    <w:p>
-      <w:pPr>
-        <w:ind w:firstLine="709"/>
-        <w:jc w:val="both"/>
-      </w:pPr>
-      <w:r>
-        <w:rPr>
-          <w:i/>
-        </w:rPr>
-        <w:t xml:space="preserve">[Opcional: los autores pueden incluir aquí un agradecimiento breve.]</w:t>
-      </w:r>
-    </w:p>
-    <w:p>
-      <w:pPr>
-        <w:jc w:val="center"/>
-        <w:rPr>
+      </w:pPr>
+    </w:p>
+    <w:p>
+      <w:pPr>
+        <w:rPr>
+          <w:rFonts w:cs="Times New Roman"/>
           <w:b/>
           <w:bCs/>
         </w:rPr>
       </w:pPr>
-      <w:r>
-        <w:rPr>
+    </w:p>
+    <w:p>
+      <w:pPr>
+        <w:rPr>
+          <w:rFonts w:cs="Times New Roman"/>
           <w:b/>
           <w:bCs/>
         </w:rPr>
-        <w:lastRenderedPageBreak/>
-        <w:t>Resumen y palabras claves</w:t>
-      </w:r>
-    </w:p>
-    <w:p>
-      <w:pPr>
-        <w:ind w:firstLine="709"/>
-        <w:jc w:val="both"/>
-      </w:pPr>
-      <w:r>
-        <w:t xml:space="preserve">Las entidades públicas colombianas deben evaluar periódicamente su nivel de madurez en seguridad de la información con base en el Instrumento de Identificación de la Línea Base de Seguridad del Modelo de Seguridad y Privacidad de la Información (MSPI) de MinTIC, fundamentado en el Anexo A de ISO/IEC 27001, el ciclo PHVA (Planificar-Hacer-Verificar-Actuar) y el marco NIST CSF. Actualmente este instrumento se diligencia de forma manual en una hoja de cálculo de nueve hojas, lo que genera errores de cálculo, ausencia de trazabilidad de evidencias, falta de control de acceso diferenciado y nula comparabilidad histórica entre evaluaciones. Este proyecto de grado presenta el diseño y la implementación de MSPI, una plataforma de software basada en arquitectura de microservicios (backend en Java/Spring Boot con arquitectura hexagonal) y microfrontends (frontend en Angular), que automatiza el instrumento completo: levantamiento de información, asignación de áreas y responsables, calificación de controles administrativos y técnicos del Anexo A, cálculo ponderado del avance PHVA, determinación del nivel de madurez del SGSI, evaluación frente a NIST CSF, gestión de evidencias documentales, identidad y control de acceso basado en roles, y generación de reportes. El sistema se compone de ocho microservicios (seis activos: ms_iam, ms_org, ms_catalog, ms_assessment, ms_evidence y ms_reporting) y seis microfrontends (mf_shell, mf_auth, mf_org, mf_assessment, mf_evidence y mf_reports), desplegados con Docker y respaldados por PostgreSQL y Keycloak. La metodología de desarrollo siguió un enfoque ágil iterativo-incremental organizado en ocho sprints, y la investigación se sitúa en el tipo aplicado o tecnológico, con un enfoque predominantemente cualitativo (análisis del proceso manual existente y diseño de la solución) complementado con verificación cuantitativa de las fórmulas de cálculo del instrumento. Entre los principales resultados se destaca la implementación funcional completa de seis de los ocho microservicios y de los seis microfrontends planificados, así como la identificación de limitaciones relevantes para el trabajo futuro, entre ellas la cobertura de pruebas automatizadas heterogénea entre backend y frontend y la implementación pendiente de los módulos de administración y auditoría transversal. El proyecto demuestra la viabilidad técnica de digitalizar un instrumento regulatorio de seguridad de la información colombiano mediante una arquitectura moderna, distribuida y trazable, sentando una base reutilizable para futuras entidades públicas que deban adoptar el modelo MSPI.</w:t>
-      </w:r>
-    </w:p>
-    <w:p>
-      <w:pPr>
-        <w:ind w:firstLine="709"/>
-        <w:jc w:val="both"/>
-      </w:pPr>
-      <w:r>
-        <w:rPr>
-          <w:i/>
-        </w:rPr>
-        <w:t xml:space="preserve">Palabras clave: ISO/IEC 27001, Modelo de Seguridad y Privacidad de la Información (MSPI), microservicios, microfrontends, gestión de seguridad de la información.</w:t>
-      </w:r>
-    </w:p>
-    <w:p>
-      <w:pPr>
-        <w:jc w:val="center"/>
-        <w:rPr>
+      </w:pPr>
+    </w:p>
+    <w:p>
+      <w:pPr>
+        <w:rPr>
+          <w:rFonts w:cs="Times New Roman"/>
           <w:b/>
           <w:bCs/>
         </w:rPr>
       </w:pPr>
-      <w:r>
-        <w:rPr>
-          <w:b/>
-        </w:rPr>
-        <w:t xml:space="preserve">Abstract and key words</w:t>
-      </w:r>
-    </w:p>
-    <w:p>
-      <w:pPr>
-        <w:ind w:firstLine="709"/>
-        <w:jc w:val="both"/>
-      </w:pPr>
-      <w:r>
-        <w:t xml:space="preserve">Colombian public entities are required to periodically assess their information security maturity level using the Security Baseline Identification Instrument of MinTIC's Information Security and Privacy Model (MSPI), grounded in Annex A of ISO/IEC 27001, the PDCA cycle (Plan-Do-Check-Act) and the NIST Cybersecurity Framework. This instrument is currently filled out manually in a nine-sheet spreadsheet, which leads to calculation errors, lack of evidence traceability, absence of role-based access control and no historical comparability between assessments. This undergraduate thesis presents the design and implementation of MSPI, a software platform based on a microservices architecture (Java/Spring Boot backend with hexagonal architecture) and micro-frontends (Angular frontend), that automates the full instrument: information gathering, area and responsible-party assignment, scoring of administrative and technical Annex A controls, weighted PDCA progress calculation, SGSI maturity level determination, NIST CSF evaluation, documentary evidence management, identity and role-based access control, and report generation. The system comprises eight microservices (six active: ms_iam, ms_org, ms_catalog, ms_assessment, ms_evidence and ms_reporting) and six micro-frontends (mf_shell, mf_auth, mf_org, mf_assessment, mf_evidence and mf_reports), deployed with Docker and backed by PostgreSQL and Keycloak. The development approach followed an agile, iterative-incremental process organized in eight sprints, and the research is classified as applied/technological, predominantly qualitative, complemented with quantitative verification of the instrument's calculation formulas. Key results include the complete functional implementation of six of the eight planned microservices and all six micro-frontends, as well as the identification of relevant limitations for future work, such as uneven automated test coverage between backend and frontend and the pending implementation of the administration and cross-cutting audit modules. The project demonstrates the technical feasibility of digitizing a Colombian information-security regulatory instrument through a modern, distributed and traceable architecture, laying a reusable foundation for other public entities that must adopt the MSPI model.</w:t>
-      </w:r>
-    </w:p>
-    <w:p>
-      <w:pPr>
-        <w:ind w:firstLine="709"/>
-        <w:jc w:val="both"/>
-      </w:pPr>
-      <w:r>
-        <w:rPr>
-          <w:i/>
-        </w:rPr>
-        <w:t xml:space="preserve">Keywords: ISO/IEC 27001, Information Security and Privacy Model (MSPI), microservices, micro-frontends, information security management.</w:t>
-      </w:r>
     </w:p>
     <w:p>
       <w:pPr>
@@ -1537,120 +1456,39 @@
     </w:p>
     <w:p>
       <w:pPr>
+        <w:spacing w:line="240" w:lineRule="auto"/>
         <w:rPr>
           <w:rFonts w:cs="Times New Roman"/>
           <w:b/>
           <w:bCs/>
         </w:rPr>
       </w:pPr>
-    </w:p>
-    <w:p>
-      <w:pPr>
+      <w:r>
         <w:rPr>
           <w:rFonts w:cs="Times New Roman"/>
           <w:b/>
           <w:bCs/>
         </w:rPr>
-      </w:pPr>
-    </w:p>
-    <w:p>
-      <w:pPr>
+        <w:br w:type="page"/>
+      </w:r>
+    </w:p>
+    <w:p>
+      <w:pPr>
+        <w:jc w:val="center"/>
         <w:rPr>
           <w:rFonts w:cs="Times New Roman"/>
           <w:b/>
           <w:bCs/>
         </w:rPr>
       </w:pPr>
-    </w:p>
-    <w:p>
-      <w:pPr>
+      <w:r>
         <w:rPr>
           <w:rFonts w:cs="Times New Roman"/>
           <w:b/>
           <w:bCs/>
         </w:rPr>
-      </w:pPr>
-    </w:p>
-    <w:p>
-      <w:pPr>
-        <w:spacing w:line="240" w:lineRule="auto"/>
-        <w:rPr>
-          <w:rFonts w:cs="Times New Roman"/>
-          <w:b/>
-          <w:bCs/>
-        </w:rPr>
-      </w:pPr>
-      <w:r>
-        <w:rPr>
-          <w:rFonts w:cs="Times New Roman"/>
-          <w:b/>
-          <w:bCs/>
-        </w:rPr>
-        <w:br w:type="page"/>
-      </w:r>
-    </w:p>
-    <w:p>
-      <w:pPr>
-        <w:jc w:val="center"/>
-        <w:rPr>
-          <w:rFonts w:cs="Times New Roman"/>
-          <w:b/>
-          <w:bCs/>
-        </w:rPr>
-      </w:pPr>
-      <w:r>
-        <w:rPr>
-          <w:rFonts w:cs="Times New Roman"/>
-          <w:b/>
-          <w:bCs/>
-        </w:rPr>
         <w:lastRenderedPageBreak/>
         <w:t>Tabla de contenido</w:t>
-      </w:r>
-    </w:p>
-    <w:p>
-      <w:pPr>
-        <w:ind w:firstLine="708"/>
-        <w:jc w:val="both"/>
-        <w:rPr>
-          <w:rFonts w:cs="Times New Roman"/>
-        </w:rPr>
-      </w:pPr>
-      <w:r>
-        <w:rPr>
-          <w:rFonts w:cs="Times New Roman"/>
-        </w:rPr>
-        <w:t>Use las herramientas de Word para generar tablas de manera automática. Se sugiere incluir</w:t>
-      </w:r>
-      <w:r>
-        <w:rPr>
-          <w:rFonts w:cs="Times New Roman"/>
-        </w:rPr>
-        <w:t xml:space="preserve"> en la tabla de contenido</w:t>
-      </w:r>
-      <w:r>
-        <w:rPr>
-          <w:rFonts w:cs="Times New Roman"/>
-        </w:rPr>
-        <w:t xml:space="preserve"> </w:t>
-      </w:r>
-      <w:r>
-        <w:rPr>
-          <w:rFonts w:cs="Times New Roman"/>
-        </w:rPr>
-        <w:t>hasta los títulos de tercer nivel</w:t>
-      </w:r>
-      <w:r>
-        <w:rPr>
-          <w:rFonts w:cs="Times New Roman"/>
-        </w:rPr>
-        <w:t>, así:</w:t>
-      </w:r>
-      <w:r>
-        <w:rPr>
-          <w:rFonts w:cs="Times New Roman"/>
-        </w:rPr>
-        <w:t xml:space="preserve"> </w:t>
       </w:r>
     </w:p>
     <w:sdt>
@@ -2219,7 +2057,7 @@
                 <w:rStyle w:val="Hipervnculo"/>
                 <w:noProof/>
               </w:rPr>
-              <w:t>Accedentes de la investigación</w:t>
+              <w:t>Antecedentes de la investigación</w:t>
             </w:r>
             <w:r>
               <w:rPr>
@@ -3542,7 +3380,7 @@
             <w:i/>
             <w:noProof/>
           </w:rPr>
-          <w:t>Nombre de la tabla</w:t>
+          <w:t>Cronograma de actividades por sprint</w:t>
         </w:r>
         <w:r>
           <w:rPr>
@@ -3608,541 +3446,6 @@
         <w:fldChar w:fldCharType="end"/>
       </w:r>
     </w:p>
-    <w:tbl>
-      <w:tblPr>
-        <w:tblW w:w="5000" w:type="pct"/>
-        <w:tblCellMar>
-          <w:top w:w="113" w:type="dxa"/>
-        </w:tblCellMar>
-        <w:tblLook w:val="04A0" w:firstRow="1" w:lastRow="0" w:firstColumn="1" w:lastColumn="0" w:noHBand="0" w:noVBand="1"/>
-      </w:tblPr>
-      <w:tblGrid>
-        <w:gridCol w:w="709"/>
-        <w:gridCol w:w="8129"/>
-      </w:tblGrid>
-      <w:tr>
-        <w:trPr>
-          <w:tblHeader/>
-        </w:trPr>
-        <w:tc>
-          <w:tcPr>
-            <w:tcW w:w="401" w:type="pct"/>
-            <w:tcBorders>
-              <w:top w:val="single" w:sz="4" w:space="0" w:color="auto"/>
-              <w:bottom w:val="single" w:sz="4" w:space="0" w:color="auto"/>
-            </w:tcBorders>
-            <w:shd w:val="clear" w:color="auto" w:fill="auto"/>
-            <w:vAlign w:val="center"/>
-          </w:tcPr>
-          <w:p>
-            <w:pPr>
-              <w:spacing w:line="240" w:lineRule="auto"/>
-              <w:jc w:val="both"/>
-              <w:rPr>
-                <w:rFonts w:cs="Times New Roman"/>
-                <w:b/>
-                <w:bCs/>
-              </w:rPr>
-            </w:pPr>
-            <w:r>
-              <w:rPr>
-                <w:rFonts w:cs="Times New Roman"/>
-                <w:b/>
-                <w:bCs/>
-              </w:rPr>
-              <w:t>No.</w:t>
-            </w:r>
-          </w:p>
-        </w:tc>
-        <w:tc>
-          <w:tcPr>
-            <w:tcW w:w="4599" w:type="pct"/>
-            <w:tcBorders>
-              <w:top w:val="single" w:sz="4" w:space="0" w:color="auto"/>
-              <w:bottom w:val="single" w:sz="4" w:space="0" w:color="auto"/>
-            </w:tcBorders>
-            <w:shd w:val="clear" w:color="auto" w:fill="auto"/>
-            <w:vAlign w:val="center"/>
-          </w:tcPr>
-          <w:p>
-            <w:pPr>
-              <w:spacing w:line="240" w:lineRule="auto"/>
-              <w:jc w:val="both"/>
-              <w:rPr>
-                <w:rFonts w:cs="Times New Roman"/>
-                <w:b/>
-                <w:bCs/>
-              </w:rPr>
-            </w:pPr>
-            <w:r>
-              <w:rPr>
-                <w:rFonts w:cs="Times New Roman"/>
-                <w:b/>
-                <w:bCs/>
-              </w:rPr>
-              <w:t>Características de una tabla según APA 7</w:t>
-            </w:r>
-          </w:p>
-        </w:tc>
-      </w:tr>
-      <w:tr>
-        <w:trPr>
-          <w:tblHeader/>
-        </w:trPr>
-        <w:tc>
-          <w:tcPr>
-            <w:tcW w:w="401" w:type="pct"/>
-            <w:tcBorders>
-              <w:top w:val="single" w:sz="4" w:space="0" w:color="auto"/>
-            </w:tcBorders>
-            <w:shd w:val="clear" w:color="auto" w:fill="auto"/>
-            <w:vAlign w:val="center"/>
-          </w:tcPr>
-          <w:p>
-            <w:pPr>
-              <w:pStyle w:val="Prrafodelista"/>
-              <w:numPr>
-                <w:ilvl w:val="0"/>
-                <w:numId w:val="4"/>
-              </w:numPr>
-              <w:spacing w:line="240" w:lineRule="auto"/>
-              <w:jc w:val="both"/>
-              <w:rPr>
-                <w:rFonts w:cs="Times New Roman"/>
-              </w:rPr>
-            </w:pPr>
-          </w:p>
-        </w:tc>
-        <w:tc>
-          <w:tcPr>
-            <w:tcW w:w="4599" w:type="pct"/>
-            <w:tcBorders>
-              <w:top w:val="single" w:sz="4" w:space="0" w:color="auto"/>
-            </w:tcBorders>
-            <w:shd w:val="clear" w:color="auto" w:fill="auto"/>
-            <w:vAlign w:val="center"/>
-          </w:tcPr>
-          <w:p>
-            <w:pPr>
-              <w:spacing w:line="240" w:lineRule="auto"/>
-              <w:jc w:val="both"/>
-              <w:rPr>
-                <w:rFonts w:cs="Times New Roman"/>
-              </w:rPr>
-            </w:pPr>
-            <w:r>
-              <w:rPr>
-                <w:rFonts w:cs="Times New Roman"/>
-              </w:rPr>
-              <w:t xml:space="preserve">El </w:t>
-            </w:r>
-            <w:r>
-              <w:rPr>
-                <w:rFonts w:cs="Times New Roman"/>
-              </w:rPr>
-              <w:t xml:space="preserve">título y </w:t>
-            </w:r>
-            <w:r>
-              <w:rPr>
-                <w:rFonts w:cs="Times New Roman"/>
-              </w:rPr>
-              <w:t xml:space="preserve">número de tabla es </w:t>
-            </w:r>
-            <w:r>
-              <w:rPr>
-                <w:rFonts w:cs="Times New Roman"/>
-              </w:rPr>
-              <w:t xml:space="preserve">lo primero que va con la estructura “Tabla” más el número en orden consecutivo </w:t>
-            </w:r>
-            <w:r>
-              <w:rPr>
-                <w:rFonts w:cs="Times New Roman"/>
-              </w:rPr>
-              <w:t>de acuerdo con su aparición en el texto.</w:t>
-            </w:r>
-            <w:r>
-              <w:rPr>
-                <w:rFonts w:cs="Times New Roman"/>
-              </w:rPr>
-              <w:t xml:space="preserve"> Se escribe en negrilla, alineado a la izquierda.</w:t>
-            </w:r>
-          </w:p>
-        </w:tc>
-      </w:tr>
-      <w:tr>
-        <w:trPr>
-          <w:tblHeader/>
-        </w:trPr>
-        <w:tc>
-          <w:tcPr>
-            <w:tcW w:w="401" w:type="pct"/>
-            <w:shd w:val="clear" w:color="auto" w:fill="auto"/>
-            <w:vAlign w:val="center"/>
-          </w:tcPr>
-          <w:p>
-            <w:pPr>
-              <w:pStyle w:val="Prrafodelista"/>
-              <w:numPr>
-                <w:ilvl w:val="0"/>
-                <w:numId w:val="4"/>
-              </w:numPr>
-              <w:spacing w:line="240" w:lineRule="auto"/>
-              <w:jc w:val="both"/>
-              <w:rPr>
-                <w:rFonts w:cs="Times New Roman"/>
-              </w:rPr>
-            </w:pPr>
-          </w:p>
-        </w:tc>
-        <w:tc>
-          <w:tcPr>
-            <w:tcW w:w="4599" w:type="pct"/>
-            <w:shd w:val="clear" w:color="auto" w:fill="auto"/>
-            <w:vAlign w:val="center"/>
-          </w:tcPr>
-          <w:p>
-            <w:pPr>
-              <w:spacing w:line="240" w:lineRule="auto"/>
-              <w:jc w:val="both"/>
-              <w:rPr>
-                <w:rFonts w:cs="Times New Roman"/>
-              </w:rPr>
-            </w:pPr>
-            <w:r>
-              <w:rPr>
-                <w:rFonts w:cs="Times New Roman"/>
-              </w:rPr>
-              <w:t xml:space="preserve">El </w:t>
-            </w:r>
-            <w:r>
-              <w:rPr>
-                <w:rFonts w:cs="Times New Roman"/>
-              </w:rPr>
-              <w:t>nombre</w:t>
-            </w:r>
-            <w:r>
-              <w:rPr>
-                <w:rFonts w:cs="Times New Roman"/>
-              </w:rPr>
-              <w:t xml:space="preserve"> de la tabla se es</w:t>
-            </w:r>
-            <w:r>
-              <w:rPr>
-                <w:rFonts w:cs="Times New Roman"/>
-              </w:rPr>
-              <w:t>cribe sin negrilla, en cursiva, alineado a la izquierda, debajo del número de la tabla.</w:t>
-            </w:r>
-          </w:p>
-        </w:tc>
-      </w:tr>
-      <w:tr>
-        <w:tc>
-          <w:tcPr>
-            <w:tcW w:w="401" w:type="pct"/>
-            <w:shd w:val="clear" w:color="auto" w:fill="auto"/>
-            <w:vAlign w:val="center"/>
-          </w:tcPr>
-          <w:p>
-            <w:pPr>
-              <w:pStyle w:val="Prrafodelista"/>
-              <w:numPr>
-                <w:ilvl w:val="0"/>
-                <w:numId w:val="4"/>
-              </w:numPr>
-              <w:spacing w:line="240" w:lineRule="auto"/>
-              <w:jc w:val="both"/>
-              <w:rPr>
-                <w:rFonts w:cs="Times New Roman"/>
-              </w:rPr>
-            </w:pPr>
-          </w:p>
-        </w:tc>
-        <w:tc>
-          <w:tcPr>
-            <w:tcW w:w="4599" w:type="pct"/>
-            <w:shd w:val="clear" w:color="auto" w:fill="auto"/>
-            <w:vAlign w:val="center"/>
-          </w:tcPr>
-          <w:p>
-            <w:pPr>
-              <w:spacing w:line="240" w:lineRule="auto"/>
-              <w:jc w:val="both"/>
-              <w:rPr>
-                <w:rFonts w:cs="Times New Roman"/>
-              </w:rPr>
-            </w:pPr>
-            <w:r>
-              <w:rPr>
-                <w:rFonts w:cs="Times New Roman"/>
-              </w:rPr>
-              <w:t>No se trazan bordes verticales, solo horizontales.</w:t>
-            </w:r>
-          </w:p>
-        </w:tc>
-      </w:tr>
-      <w:tr>
-        <w:tc>
-          <w:tcPr>
-            <w:tcW w:w="401" w:type="pct"/>
-            <w:shd w:val="clear" w:color="auto" w:fill="auto"/>
-            <w:vAlign w:val="center"/>
-          </w:tcPr>
-          <w:p>
-            <w:pPr>
-              <w:pStyle w:val="Prrafodelista"/>
-              <w:numPr>
-                <w:ilvl w:val="0"/>
-                <w:numId w:val="4"/>
-              </w:numPr>
-              <w:spacing w:line="240" w:lineRule="auto"/>
-              <w:jc w:val="both"/>
-              <w:rPr>
-                <w:rFonts w:cs="Times New Roman"/>
-              </w:rPr>
-            </w:pPr>
-          </w:p>
-        </w:tc>
-        <w:tc>
-          <w:tcPr>
-            <w:tcW w:w="4599" w:type="pct"/>
-            <w:shd w:val="clear" w:color="auto" w:fill="auto"/>
-            <w:vAlign w:val="center"/>
-          </w:tcPr>
-          <w:p>
-            <w:pPr>
-              <w:spacing w:line="240" w:lineRule="auto"/>
-              <w:jc w:val="both"/>
-              <w:rPr>
-                <w:rFonts w:cs="Times New Roman"/>
-              </w:rPr>
-            </w:pPr>
-            <w:r>
-              <w:rPr>
-                <w:rFonts w:cs="Times New Roman"/>
-              </w:rPr>
-              <w:t xml:space="preserve">Los bordes horizontales solo aplican para los encabezados de las tablas, marcar los totales y </w:t>
-            </w:r>
-            <w:r>
-              <w:rPr>
-                <w:rFonts w:cs="Times New Roman"/>
-              </w:rPr>
-              <w:t xml:space="preserve">los finales </w:t>
-            </w:r>
-            <w:r>
-              <w:rPr>
-                <w:rFonts w:cs="Times New Roman"/>
-              </w:rPr>
-              <w:t>de la tabla.</w:t>
-            </w:r>
-          </w:p>
-        </w:tc>
-      </w:tr>
-      <w:tr>
-        <w:tc>
-          <w:tcPr>
-            <w:tcW w:w="401" w:type="pct"/>
-            <w:shd w:val="clear" w:color="auto" w:fill="auto"/>
-            <w:vAlign w:val="center"/>
-          </w:tcPr>
-          <w:p>
-            <w:pPr>
-              <w:pStyle w:val="Prrafodelista"/>
-              <w:numPr>
-                <w:ilvl w:val="0"/>
-                <w:numId w:val="4"/>
-              </w:numPr>
-              <w:spacing w:line="240" w:lineRule="auto"/>
-              <w:jc w:val="both"/>
-              <w:rPr>
-                <w:rFonts w:cs="Times New Roman"/>
-              </w:rPr>
-            </w:pPr>
-          </w:p>
-        </w:tc>
-        <w:tc>
-          <w:tcPr>
-            <w:tcW w:w="4599" w:type="pct"/>
-            <w:shd w:val="clear" w:color="auto" w:fill="auto"/>
-            <w:vAlign w:val="center"/>
-          </w:tcPr>
-          <w:p>
-            <w:pPr>
-              <w:spacing w:line="240" w:lineRule="auto"/>
-              <w:jc w:val="both"/>
-              <w:rPr>
-                <w:rFonts w:cs="Times New Roman"/>
-              </w:rPr>
-            </w:pPr>
-            <w:r>
-              <w:rPr>
-                <w:rFonts w:cs="Times New Roman"/>
-              </w:rPr>
-              <w:t xml:space="preserve">Si hay alguna aclaración, </w:t>
-            </w:r>
-            <w:r>
-              <w:rPr>
-                <w:rFonts w:cs="Times New Roman"/>
-              </w:rPr>
-              <w:t>escriba</w:t>
-            </w:r>
-            <w:r>
-              <w:rPr>
-                <w:rFonts w:cs="Times New Roman"/>
-              </w:rPr>
-              <w:t xml:space="preserve"> “</w:t>
-            </w:r>
-            <w:r>
-              <w:rPr>
-                <w:rFonts w:cs="Times New Roman"/>
-                <w:i/>
-                <w:iCs/>
-              </w:rPr>
-              <w:t>Nota.</w:t>
-            </w:r>
-            <w:r>
-              <w:rPr>
-                <w:rFonts w:cs="Times New Roman"/>
-              </w:rPr>
-              <w:t>”</w:t>
-            </w:r>
-            <w:r>
-              <w:rPr>
-                <w:rFonts w:cs="Times New Roman"/>
-              </w:rPr>
-              <w:t xml:space="preserve"> en cursiva, sin negrilla,</w:t>
-            </w:r>
-            <w:r>
-              <w:rPr>
-                <w:rFonts w:cs="Times New Roman"/>
-              </w:rPr>
-              <w:t xml:space="preserve"> alineado a la izquierda, con la misma fuente que el resto del texto</w:t>
-            </w:r>
-            <w:r>
-              <w:rPr>
-                <w:rFonts w:cs="Times New Roman"/>
-              </w:rPr>
-              <w:t xml:space="preserve"> en la línea después de la tabla, </w:t>
-            </w:r>
-            <w:r>
-              <w:rPr>
-                <w:rFonts w:cs="Times New Roman"/>
-              </w:rPr>
-              <w:t>con un punto seguido</w:t>
-            </w:r>
-            <w:r>
-              <w:rPr>
-                <w:rFonts w:cs="Times New Roman"/>
-              </w:rPr>
-              <w:t xml:space="preserve">. </w:t>
-            </w:r>
-          </w:p>
-        </w:tc>
-      </w:tr>
-      <w:tr>
-        <w:tc>
-          <w:tcPr>
-            <w:tcW w:w="401" w:type="pct"/>
-            <w:shd w:val="clear" w:color="auto" w:fill="auto"/>
-            <w:vAlign w:val="center"/>
-          </w:tcPr>
-          <w:p>
-            <w:pPr>
-              <w:pStyle w:val="Prrafodelista"/>
-              <w:numPr>
-                <w:ilvl w:val="0"/>
-                <w:numId w:val="4"/>
-              </w:numPr>
-              <w:spacing w:line="240" w:lineRule="auto"/>
-              <w:jc w:val="both"/>
-              <w:rPr>
-                <w:rFonts w:cs="Times New Roman"/>
-              </w:rPr>
-            </w:pPr>
-          </w:p>
-        </w:tc>
-        <w:tc>
-          <w:tcPr>
-            <w:tcW w:w="4599" w:type="pct"/>
-            <w:shd w:val="clear" w:color="auto" w:fill="auto"/>
-            <w:vAlign w:val="center"/>
-          </w:tcPr>
-          <w:p>
-            <w:pPr>
-              <w:spacing w:line="240" w:lineRule="auto"/>
-              <w:jc w:val="both"/>
-              <w:rPr>
-                <w:rFonts w:cs="Times New Roman"/>
-              </w:rPr>
-            </w:pPr>
-            <w:r>
-              <w:rPr>
-                <w:rFonts w:cs="Times New Roman"/>
-              </w:rPr>
-              <w:t>Las tablas deben ser creadas directamente en Word.</w:t>
-            </w:r>
-          </w:p>
-        </w:tc>
-      </w:tr>
-      <w:tr>
-        <w:tc>
-          <w:tcPr>
-            <w:tcW w:w="401" w:type="pct"/>
-            <w:tcBorders>
-              <w:bottom w:val="single" w:sz="4" w:space="0" w:color="auto"/>
-            </w:tcBorders>
-            <w:shd w:val="clear" w:color="auto" w:fill="auto"/>
-            <w:vAlign w:val="center"/>
-          </w:tcPr>
-          <w:p>
-            <w:pPr>
-              <w:pStyle w:val="Prrafodelista"/>
-              <w:numPr>
-                <w:ilvl w:val="0"/>
-                <w:numId w:val="4"/>
-              </w:numPr>
-              <w:spacing w:line="240" w:lineRule="auto"/>
-              <w:jc w:val="center"/>
-              <w:rPr>
-                <w:rFonts w:cs="Times New Roman"/>
-              </w:rPr>
-            </w:pPr>
-            <w:commentRangeStart w:id="14"/>
-          </w:p>
-        </w:tc>
-        <w:tc>
-          <w:tcPr>
-            <w:tcW w:w="4599" w:type="pct"/>
-            <w:tcBorders>
-              <w:bottom w:val="single" w:sz="4" w:space="0" w:color="auto"/>
-            </w:tcBorders>
-            <w:shd w:val="clear" w:color="auto" w:fill="auto"/>
-            <w:vAlign w:val="center"/>
-          </w:tcPr>
-          <w:p>
-            <w:pPr>
-              <w:spacing w:line="240" w:lineRule="auto"/>
-              <w:jc w:val="both"/>
-              <w:rPr>
-                <w:rFonts w:cs="Times New Roman"/>
-              </w:rPr>
-            </w:pPr>
-            <w:r>
-              <w:rPr>
-                <w:rFonts w:cs="Times New Roman"/>
-              </w:rPr>
-              <w:t>Esta tabla es el ejemplo de cómo debe ser una tabla.</w:t>
-            </w:r>
-            <w:commentRangeEnd w:id="14"/>
-            <w:r>
-              <w:rPr>
-                <w:rStyle w:val="Refdecomentario"/>
-              </w:rPr>
-              <w:commentReference w:id="14"/>
-            </w:r>
-          </w:p>
-        </w:tc>
-      </w:tr>
-    </w:tbl>
     <w:p>
       <w:pPr>
         <w:jc w:val="center"/>
@@ -4224,7 +3527,7 @@
             <w:i/>
             <w:noProof/>
           </w:rPr>
-          <w:t>Nombre de la figura</w:t>
+          <w:t>(esta propuesta no incluye figuras)</w:t>
         </w:r>
         <w:r>
           <w:rPr>
@@ -4298,7 +3601,6 @@
           <w:bCs/>
         </w:rPr>
       </w:pPr>
-      <w:commentRangeStart w:id="21"/>
       <w:r>
         <w:rPr>
           <w:b/>
@@ -4313,15 +3615,6 @@
           <w:bCs/>
         </w:rPr>
         <w:t>, acrónimos, abreviaturas</w:t>
-      </w:r>
-      <w:commentRangeEnd w:id="21"/>
-      <w:r>
-        <w:rPr>
-          <w:rStyle w:val="Refdecomentario"/>
-          <w:b/>
-          <w:bCs/>
-        </w:rPr>
-        <w:commentReference w:id="21"/>
       </w:r>
     </w:p>
     <w:tbl>
@@ -5188,7 +4481,7 @@
         <w:jc w:val="both"/>
       </w:pPr>
       <w:r>
-        <w:t xml:space="preserve">[PENDIENTE: a completar por los autores] — delimitación formal del problema en términos de población objetivo (número y tipo de entidades públicas alcanzadas por el piloto o por el alcance académico del proyecto) y la referencia normativa exacta (circular, decreto o guía de MinTIC) que exige el diligenciamiento del instrumento, para citarla formalmente en este apartado.</w:t>
+        <w:t xml:space="preserve">La población objetivo del instrumento son las entidades públicas del orden nacional y territorial sujetas a la Política de Gobierno Digital, regulada por el Decreto 1078 de 2015 y actualizada por el Decreto 767 de 2022; la Resolución 500 de 2021 del Ministerio TIC establece los lineamientos de la estrategia de seguridad digital y adopta el Modelo de Seguridad y Privacidad de la Información como habilitador de dicha política (Ministerio de Tecnologías de la Información y las Comunicaciones [MinTIC], 2021). En el alcance académico de este proyecto el sistema se valida con datos de prueba, sin un piloto en una entidad real.</w:t>
       </w:r>
     </w:p>
     <w:p>
@@ -5399,7 +4692,7 @@
         <w:jc w:val="both"/>
       </w:pPr>
       <w:r>
-        <w:t xml:space="preserve">Implementar el módulo de evaluación frente al marco NIST CSF, cubriendo sus cinco funciones (identificar, proteger, detectar, responder y recuperar).</w:t>
+        <w:t xml:space="preserve">Implementar el módulo de evaluación frente al marco NIST CSF 2.0, cubriendo sus seis funciones (gobernar, identificar, proteger, detectar, responder y recuperar).</w:t>
       </w:r>
     </w:p>
     <w:p>
@@ -5474,7 +4767,7 @@
         <w:jc w:val="both"/>
       </w:pPr>
       <w:r>
-        <w:t xml:space="preserve">El instrumento que este proyecto automatiza tiene como antecedente directo una hoja de cálculo de nueve hojas (Portada, Escala de Evaluación, Levantamiento de Información, Áreas Involucradas, Controles Administrativos, Controles Técnicos, Ciclo PHVA, Madurez y Ciberseguridad NIST), definida por MinTIC bajo el nombre de Instrumento de Identificación de la Línea Base de Seguridad, basado en ISO/IEC 27001:2013 dentro del Modelo de Seguridad y Privacidad de la Información (MSPI). El instrumento clasifica a las entidades evaluadas en cuatro categorías (Nacional, Territorial A, Territorial B y Territorial C), cada una con metas diferenciadas de avance esperado en el ciclo PHVA, lo que confirma que la población objetivo de este instrumento son entidades del sector público colombiano sujetas a dicha política.</w:t>
+        <w:t xml:space="preserve">El instrumento que este proyecto automatiza tiene como antecedente directo una hoja de cálculo de nueve hojas (Portada, Escala de Evaluación, Levantamiento de Información, Áreas Involucradas, Controles Administrativos, Controles Técnicos, Ciclo PHVA, Madurez y Ciberseguridad NIST), definida por MinTIC bajo el nombre de Instrumento de Identificación de la Línea Base de Seguridad, basado inicialmente en ISO/IEC 27001:2013 y actualizado en su autodiagnóstico a ISO/IEC 27001:2022, dentro del Modelo de Seguridad y Privacidad de la Información (MSPI). El instrumento clasifica a las entidades evaluadas en cuatro categorías (Nacional, Territorial A, Territorial B y Territorial C), cada una con metas diferenciadas de avance esperado en el ciclo PHVA, lo que confirma que la población objetivo de este instrumento son entidades del sector público colombiano sujetas a dicha política.</w:t>
       </w:r>
     </w:p>
     <w:p>
@@ -5492,7 +4785,7 @@
         <w:jc w:val="both"/>
       </w:pPr>
       <w:r>
-        <w:t xml:space="preserve">[PENDIENTE: a completar por los autores] — ampliación de antecedentes con análisis comparativo de herramientas GRC/ISMS de mercado (comerciales u open-source) y su respectiva citación bibliográfica formal en normas APA 7.ª edición, en caso de que el programa académico exija antecedentes tecnológicos específicos con fuentes verificables, así como antecedentes a nivel local, nacional e internacional de trabajos de grado similares.</w:t>
+        <w:t xml:space="preserve">En el mercado existen herramientas GRC de propósito general, comerciales y de código abierto, como Eramba, CISO Assistant y SimpleRisk, que gestionan controles de ISO/IEC 27001, riesgos y evidencias de cumplimiento (Eramba, s.f.; Intuitem, s.f.; SimpleRisk, s.f.). Estas herramientas permiten configurar marcos de control, pero no incorporan las reglas de cálculo específicas del instrumento MSPI de MinTIC (ponderación PHVA por tipo de entidad, determinación acumulativa del nivel de madurez y su hoja de ciberseguridad), lo que exigiría reconstruirlas manualmente en cada entidad. La ampliación con trabajos de grado locales, nacionales e internacionales queda a cargo de los autores.</w:t>
       </w:r>
     </w:p>
     <w:p>
@@ -5517,7 +4810,7 @@
         <w:jc w:val="both"/>
       </w:pPr>
       <w:r>
-        <w:t xml:space="preserve">Un Sistema de Gestión de Seguridad de la Información (SGSI) es el marco de políticas, procesos y controles que una organización implementa para gestionar el riesgo sobre la confidencialidad, la integridad y la disponibilidad de su información, de acuerdo con la norma ISO/IEC 27001. El Anexo A de esta norma, en su versión 2013, agrupa 114 controles en 14 dominios (de A.5 a A.18); esta es la versión empleada como base de la escala de calificación de controles administrativos y técnicos del instrumento MSPI, aunque la versión vigente de la norma al momento de redactar este documento es ISO/IEC 27001:2022, cuyo Anexo A reorganiza los controles en 4 categorías y 93 controles.</w:t>
+        <w:t xml:space="preserve">Un Sistema de Gestión de Seguridad de la Información (SGSI) es el marco de políticas, procesos y controles que una organización implementa para gestionar el riesgo sobre la confidencialidad, la integridad y la disponibilidad de su información, de acuerdo con la norma ISO/IEC 27001 (International Organization for Standardization [ISO], 2022a). El Anexo A de esta norma, en su versión 2013, agrupa 114 controles en 14 dominios (de A.5 a A.18); esta es la versión empleada como base de la escala de calificación de controles administrativos y técnicos del instrumento MSPI, aunque la versión vigente de la norma al momento de redactar este documento es ISO/IEC 27001:2022, cuyo Anexo A reorganiza los controles en 4 temas y 93 controles (ISO, 2022a, 2022b). La plataforma soporta ambas versiones mediante versiones del catálogo: la versión 1 sigue la estructura de 2013 y la versión 2 la de 2022, alineada con el autodiagnóstico vigente de MinTIC.</w:t>
       </w:r>
     </w:p>
     <w:p>
@@ -5526,7 +4819,7 @@
         <w:jc w:val="both"/>
       </w:pPr>
       <w:r>
-        <w:t xml:space="preserve">El ciclo PHVA (Planificar–Hacer–Verificar–Actuar) es el modelo de mejora continua adoptado por ISO/IEC 27001 para la operación del SGSI; en el instrumento MSPI se implementa como cuatro componentes ponderados: planificación, implementación, evaluación de desempeño y mejora continua. El nivel de madurez de un SGSI, por su parte, se determina en el instrumento mediante una escala de cinco niveles organizacionales acumulativos (inicial, gestionado, definido, gestionado cuantitativamente y optimizado), un patrón conceptualmente afín a los modelos de madurez de capacidades (como CMMI) adaptados al dominio de seguridad de la información. El marco NIST Cybersecurity Framework (CSF) se incorpora como una segunda lente de evaluación, complementaria a ISO/IEC 27001, organizada en cinco funciones: identificar, proteger, detectar, responder y recuperar.</w:t>
+        <w:t xml:space="preserve">El ciclo PHVA (Planificar–Hacer–Verificar–Actuar) es el modelo de mejora continua adoptado por ISO/IEC 27001 para la operación del SGSI; en el instrumento MSPI se implementa como cuatro componentes ponderados: planificación, implementación, evaluación de desempeño y mejora continua. El nivel de madurez de un SGSI, por su parte, se determina en el instrumento mediante una escala de cinco niveles organizacionales acumulativos (inicial, gestionado, definido, gestionado cuantitativamente y optimizado), un patrón conceptualmente afín a los modelos de madurez de capacidades (como CMMI) adaptados al dominio de seguridad de la información. El marco NIST Cybersecurity Framework (CSF) se incorpora como una segunda lente de evaluación, complementaria a ISO/IEC 27001, organizada en su versión 2.0 en seis funciones: gobernar, identificar, proteger, detectar, responder y recuperar (National Institute of Standards and Technology [NIST], 2024).</w:t>
       </w:r>
     </w:p>
     <w:p>
@@ -5535,7 +4828,7 @@
         <w:jc w:val="both"/>
       </w:pPr>
       <w:r>
-        <w:t xml:space="preserve">Desde la perspectiva de la arquitectura de software, el proyecto se fundamenta en tres estilos arquitectónicos. Primero, la arquitectura de microservicios, que descompone el sistema en servicios autónomos y desplegables de forma independiente, organizados alrededor de capacidades de negocio; el backend aplica este estilo mediante ocho microservicios (identidad, organización, catálogo, evaluación, evidencia, reportes y dos módulos adicionales de administración y auditoría). Segundo, la arquitectura hexagonal (o Clean Architecture), que aísla el dominio de negocio de los detalles de infraestructura -framework web, motor de persistencia, proveedores externos- mediante puertos y adaptadores, lo que facilita probar el motor de cálculo del instrumento de forma unitaria, sin depender de infraestructura real. Tercero, la arquitectura de microfrontends, que extiende el principio de microservicios a la capa de presentación, permitiendo que distintos módulos de interfaz se desarrollen y desplieguen de forma independiente y se compongan en un frontend anfitrión (shell).</w:t>
+        <w:t xml:space="preserve">Desde la perspectiva de la arquitectura de software, el proyecto se fundamenta en tres estilos arquitectónicos. Primero, la arquitectura de microservicios, que descompone el sistema en servicios autónomos y desplegables de forma independiente, organizados alrededor de capacidades de negocio (Lewis &amp; Fowler, 2014; Newman, 2021); el backend aplica este estilo mediante ocho microservicios (identidad, organización, catálogo, evaluación, evidencia, reportes y dos módulos adicionales de administración y auditoría). Segundo, la arquitectura hexagonal (o Clean Architecture), que aísla el dominio de negocio de los detalles de infraestructura -framework web, motor de persistencia, proveedores externos- mediante puertos y adaptadores (Cockburn, 2005; Martin, 2017), lo que facilita probar el motor de cálculo del instrumento de forma unitaria, sin depender de infraestructura real. Tercero, la arquitectura de microfrontends, que extiende el principio de microservicios a la capa de presentación, permitiendo que distintos módulos de interfaz se desarrollen y desplieguen de forma independiente y se compongan en un frontend anfitrión (shell) (Geers, 2020). En este proyecto la composición se realiza con iframes y mensajería postMessage entre el anfitrión y cada microfrontend, que ofrece aislamiento y despliegue independiente; la federación de módulos queda como evolución futura.</w:t>
       </w:r>
     </w:p>
     <w:p>
@@ -5553,7 +4846,7 @@
         <w:jc w:val="both"/>
       </w:pPr>
       <w:r>
-        <w:t xml:space="preserve">[PENDIENTE: a completar por los autores] — desarrollo teórico ampliado con citación formal en normas APA 7.ª edición de ISO/IEC 27001, ISO/IEC 27002, NIST CSF y de la literatura de referencia en arquitectura de software (microservicios, arquitectura hexagonal/Clean Architecture, microfrontends) efectivamente consultada por los autores.</w:t>
+        <w:t xml:space="preserve">El control de acceso se apoya en el estándar de tokens JSON Web Token y en la autenticación de segundo factor basada en tiempo (TOTP), y el patrón de microservicios se complementa con la comunicación servidor a servidor mediante claves internas y con una bitácora de auditoría centralizada (Richardson, 2018).</w:t>
       </w:r>
     </w:p>
     <w:p>
@@ -5587,7 +4880,7 @@
         <w:jc w:val="both"/>
       </w:pPr>
       <w:r>
-        <w:t xml:space="preserve">[PENDIENTE: a completar por los autores] — referencia normativa formal y citable (circular, decreto, guía o resolución de MinTIC) que exige de manera explícita el diligenciamiento del instrumento MSPI, así como la eventual referencia a la Ley 1581 de 2012 de protección de datos personales u otra normatividad colombiana aplicable a la gestión de evidencias documentales del sistema, en caso de que corresponda al alcance del proyecto.</w:t>
+        <w:t xml:space="preserve">A nivel nacional aplican: el Decreto 1078 de 2015, Decreto Único Reglamentario del sector TIC, y el Decreto 767 de 2022, que establece los lineamientos de la Política de Gobierno Digital; la Resolución 500 de 2021 del Ministerio TIC, que adopta el Modelo de Seguridad y Privacidad de la Información (MinTIC, 2021); la Ley 1581 de 2012 y el Decreto 1377 de 2013, sobre protección de datos personales, que rigen el tratamiento de los datos de los usuarios de la plataforma; la Ley 1273 de 2009, sobre delitos informáticos; y la Ley 23 de 1982 y la Decisión Andina 351 de 1993, sobre derecho de autor del software (Congreso de la República de Colombia, 2012). El repositorio de documentación del proyecto incluye la política de privacidad, los términos de uso y las demás políticas derivadas de este marco.</w:t>
       </w:r>
     </w:p>
     <w:p>
@@ -5622,7 +4915,7 @@
         <w:jc w:val="both"/>
       </w:pPr>
       <w:r>
-        <w:t xml:space="preserve">Este trabajo corresponde a un desarrollo tecnológico de software y no a un estudio con población o muestra en el sentido tradicional de la investigación social. El objeto de estudio es el propio instrumento de línea base de seguridad (su especificación funcional, fórmulas de cálculo y estructura de datos) y el repositorio de código fuente construido a partir de él. El equipo de trabajo está conformado por los dos autores de este documento, Bairon Alexander Suarez Camacho y Juan Diego Tovar Rodriguez, estudiantes del programa de Ingeniería de Sistemas, con acompañamiento de un(a) director(a) o asesor(a) [PENDIENTE: nombre a confirmar]. La selección del instrumento MSPI como objeto de estudio no fue muestral, sino intencional: se seleccionó por ser un proceso manual real, documentado y con reglas de cálculo verificables, apto para ser reproducido fielmente en software.</w:t>
+        <w:t xml:space="preserve">Este trabajo corresponde a un desarrollo tecnológico de software y no a un estudio con población o muestra en el sentido tradicional de la investigación social. El objeto de estudio es el propio instrumento de línea base de seguridad (su especificación funcional, fórmulas de cálculo y estructura de datos) y el repositorio de código fuente construido a partir de él. El equipo de trabajo está conformado por los dos autores de este documento, Bairon Alexander Suarez Camacho y Juan Diego Tovar Rodriguez, estudiantes del programa de Ingeniería de Sistemas, con la dirección del ingeniero Luis Ángel Vargas Narvaez. La selección del instrumento MSPI como objeto de estudio no fue muestral, sino intencional: se seleccionó por ser un proceso manual real, documentado y con reglas de cálculo verificables, apto para ser reproducido fielmente en software.</w:t>
       </w:r>
     </w:p>
     <w:p>
@@ -5729,7 +5022,7 @@
         <w:jc w:val="both"/>
       </w:pPr>
       <w:r>
-        <w:t xml:space="preserve">El desarrollo del proyecto no involucró el procesamiento de datos personales reales de entidades públicas ni de sus funcionarios; los datos empleados durante el desarrollo y las pruebas corresponden a información de prueba o simulada. En caso de que el sistema llegue a validarse con datos reales de una entidad piloto, deberá garantizarse el cumplimiento de la normatividad colombiana de protección de datos personales (Ley 1581 de 2012) y de los principios de confidencialidad propios de la información de seguridad de una entidad pública. [PENDIENTE: a completar por los autores] — declaración formal de consideraciones éticas si el proyecto llegó a emplear datos reales de alguna entidad o de personas identificables durante su desarrollo o validación.</w:t>
+        <w:t xml:space="preserve">El desarrollo del proyecto no involucró el procesamiento de datos personales reales de entidades públicas ni de sus funcionarios; los datos empleados durante el desarrollo y las pruebas corresponden a información de prueba o simulada. En caso de que el sistema llegue a validarse con datos reales de una entidad piloto, deberá garantizarse el cumplimiento de la normatividad colombiana de protección de datos personales (Ley 1581 de 2012) y de los principios de confidencialidad propios de la información de seguridad de una entidad pública. El tratamiento de los datos de los usuarios de la plataforma se rige por la política de privacidad, la autorización de tratamiento y el acuerdo de confidencialidad incluidos en el repositorio de documentación del proyecto.</w:t>
       </w:r>
     </w:p>
     <w:p>
@@ -5768,6 +5061,30 @@
       </w:pPr>
       <w:r>
         <w:t xml:space="preserve">El desarrollo se organizó en ocho sprints funcionales sucesivos, cada uno con entregables verificables frente a la especificación del instrumento. Las fechas exactas de inicio y cierre de cada sprint [PENDIENTE: a completar por los autores] deben incorporarse en la siguiente tabla antes de la entrega final.</w:t>
+      </w:r>
+    </w:p>
+    <w:p>
+      <w:pPr>
+        <w:ind w:firstLine="709"/>
+        <w:jc w:val="both"/>
+      </w:pPr>
+      <w:r>
+        <w:rPr>
+          <w:b/>
+        </w:rPr>
+        <w:t xml:space="preserve">Tabla 1</w:t>
+      </w:r>
+    </w:p>
+    <w:p>
+      <w:pPr>
+        <w:ind w:firstLine="709"/>
+        <w:jc w:val="both"/>
+      </w:pPr>
+      <w:r>
+        <w:rPr>
+          <w:i/>
+        </w:rPr>
+        <w:t xml:space="preserve">Cronograma de actividades por sprint</w:t>
       </w:r>
     </w:p>
     <w:tbl>
@@ -6105,7 +5422,7 @@
         <w:jc w:val="both"/>
       </w:pPr>
       <w:r>
-        <w:t xml:space="preserve">El backend construido comprende ocho microservicios: seis de ellos activos y con puerto asignado (ms_iam — identidad, autenticación y auditoría; ms_org — organizaciones y geografía; ms_catalog — catálogo versionado de controles, escalas e ítems PHVA/madurez/NIST; ms_assessment — ciclo de vida de evaluaciones y motor de cálculo; ms_evidence — contexto organizacional y evidencias documentales; y ms_reporting — generación asíncrona de reportes), y dos (ms_admin y ms_audit) que permanecen como módulos reservados en el diseño de la arquitectura, sin funcionalidad activa al cierre de este documento. El frontend comprende seis microfrontends (mf_shell, mf_auth, mf_org, mf_assessment, mf_evidence y mf_reports), construidos en Angular y contenerizados con Nginx.</w:t>
+        <w:t xml:space="preserve">El backend construido comprende ocho microservicios activos, cada uno con su puerto y su esquema de base de datos: ms_iam (identidad, autenticación con segundo factor, notificaciones y reenvío de contraseñas), ms_org (organizaciones y geografía), ms_catalog (catálogo versionado de controles, escalas e ítems PHVA, madurez y NIST), ms_assessment (ciclo de vida de evaluaciones y motor de cálculo), ms_evidence (contexto organizacional y evidencias documentales), ms_reporting (generación asíncrona del instrumento oficial en Excel y PDF), ms_audit (bitácora central de auditoría) y ms_admin (parámetros globales del sistema). En conjunto exponen 156 servicios REST sobre un modelo de datos de 73 tablas en 8 esquemas. El frontend comprende seis microfrontends (mf_shell, mf_auth, mf_org, mf_assessment, mf_evidence y mf_reports), construidos en Angular y contenerizados con Nginx.</w:t>
       </w:r>
     </w:p>
     <w:p>
@@ -6123,7 +5440,7 @@
         <w:jc w:val="both"/>
       </w:pPr>
       <w:r>
-        <w:t xml:space="preserve">La discusión de estos resultados exige señalar, con transparencia, algunas limitaciones detectadas durante el desarrollo. Primero, la cobertura de pruebas automatizadas resultó heterogénea entre backend y frontend: mientras el backend incorpora un conjunto de pruebas unitarias con JUnit y Mockito, el frontend carece de pruebas automatizadas equivalentes, lo que representa un riesgo de regresión no mitigado en la capa de presentación. Segundo, dos de los ocho microservicios (ms_admin y ms_audit) no alcanzaron implementación funcional dentro del alcance efectivamente construido, por lo que las capacidades de administración general y auditoría transversal consolidada quedan como trabajo pendiente. Tercero, se identificó una diferencia entre el mecanismo de composición de microfrontends originalmente planificado (Module Federation de Webpack) y el mecanismo verificado en al menos uno de los microfrontends piloto, que emplea composición por navegación de página completa en lugar de federación de módulos; esta diferencia debe documentarse y, de ser necesario, resolverse antes de la entrega final.</w:t>
+        <w:t xml:space="preserve">La discusión de estos resultados exige señalar, con transparencia, las limitaciones detectadas. Primero, la cobertura de pruebas automatizadas es heterogénea: el backend cuenta con 83 clases de prueba y 354 casos con JUnit y Mockito, mientras que en el frontend solo un microfrontend tiene pruebas unitarias, lo que deja un riesgo de regresión en la capa de presentación. Segundo, la composición de microfrontends se implementó con iframes y postMessage en lugar de Module Federation; la decisión se documentó como registro de arquitectura por el aislamiento y el despliegue independiente que ofrece. Tercero, la revisión del código identificó ajustes necesarios antes de un despliegue productivo, como parametrizar las direcciones del frontend por entorno y reforzar el control de propiedad en el servicio de notificaciones.</w:t>
       </w:r>
     </w:p>
     <w:p>
@@ -6132,7 +5449,7 @@
         <w:jc w:val="both"/>
       </w:pPr>
       <w:r>
-        <w:t xml:space="preserve">En conjunto, los resultados alcanzados evidencian que el enfoque de arquitectura de microservicios y microfrontends, combinado con arquitectura hexagonal en el backend, permitió aislar el motor de cálculo del instrumento de los detalles de infraestructura y avanzar de forma incremental por dominio funcional, si bien persisten brechas de cobertura de pruebas y de alcance funcional pendientes de cerrar antes de considerar el sistema listo para un despliegue en producción con una entidad real.</w:t>
+        <w:t xml:space="preserve">En conjunto, los resultados alcanzados evidencian que el enfoque de arquitectura de microservicios y microfrontends, combinado con arquitectura hexagonal en el backend, permitió aislar el motor de cálculo del instrumento de los detalles de infraestructura y avanzar de forma incremental por dominio funcional, si bien persisten brechas de cobertura de pruebas y de preparación para producción que deben cerrarse antes de desplegar el sistema con una entidad real.</w:t>
       </w:r>
     </w:p>
     <w:p>
@@ -6204,7 +5521,7 @@
         <w:jc w:val="both"/>
       </w:pPr>
       <w:r>
-        <w:t xml:space="preserve">Dos microservicios (ms_admin y ms_audit) quedaron fuera del perímetro funcional efectivamente construido, lo que delimita el alcance real logrado frente al alcance arquitectónico originalmente contemplado.</w:t>
+        <w:t xml:space="preserve">Los microservicios transversales de auditoría (ms_audit) y administración (ms_admin) se implementaron, lo que permitió centralizar la trazabilidad de todas las operaciones y parametrizar plazos y periodos de gracia sin modificar el código.</w:t>
       </w:r>
     </w:p>
     <w:p>
@@ -6217,7 +5534,7 @@
         <w:jc w:val="both"/>
       </w:pPr>
       <w:r>
-        <w:t xml:space="preserve">Se identificó una discrepancia entre el mecanismo de integración de microfrontends planificado (Module Federation) y el efectivamente verificado en al menos un microfrontend piloto, discrepancia que debe resolverse o justificarse formalmente.</w:t>
+        <w:t xml:space="preserve">La composición de microfrontends mediante iframes y postMessage resultó adecuada para el alcance del proyecto y quedó justificada formalmente; la federación de módulos se mantiene como evolución futura.</w:t>
       </w:r>
     </w:p>
     <w:p>
@@ -6230,7 +5547,7 @@
         <w:jc w:val="both"/>
       </w:pPr>
       <w:r>
-        <w:t xml:space="preserve">El instrumento fuente referencia la versión 2013 de ISO/IEC 27001, mientras que la versión vigente de la norma es la de 2022; esta decisión de fidelidad al instrumento MinTIC de 2013 debe justificarse explícitamente como alcance académico y técnico del proyecto.</w:t>
+        <w:t xml:space="preserve">El catálogo versionado permitió soportar tanto la estructura de ISO/IEC 27001:2013 del instrumento original como la de ISO/IEC 27001:2022 y NIST CSF 2.0 del autodiagnóstico vigente, sin alterar las evaluaciones históricas.</w:t>
       </w:r>
     </w:p>
     <w:p>
@@ -6263,7 +5580,7 @@
         <w:jc w:val="both"/>
       </w:pPr>
       <w:r>
-        <w:t xml:space="preserve">Completar la implementación funcional de los microservicios ms_admin y ms_audit, priorizándolos según el impacto que tengan sobre la trazabilidad transversal del sistema.</w:t>
+        <w:t xml:space="preserve">Parametrizar por entorno las direcciones del frontend y reforzar el control de propiedad en el servicio de notificaciones antes de un despliegue productivo.</w:t>
       </w:r>
     </w:p>
     <w:p>
@@ -6276,7 +5593,7 @@
         <w:jc w:val="both"/>
       </w:pPr>
       <w:r>
-        <w:t xml:space="preserve">Uniformar el mecanismo de composición de microfrontends (Module Federation) en los seis módulos de frontend, o documentar y justificar formalmente la composición alternativa adoptada.</w:t>
+        <w:t xml:space="preserve">Evaluar la migración de la composición de microfrontends a Module Federation si el número de módulos o el rendimiento de carga lo justifican.</w:t>
       </w:r>
     </w:p>
     <w:p>
@@ -6302,7 +5619,7 @@
         <w:jc w:val="both"/>
       </w:pPr>
       <w:r>
-        <w:t xml:space="preserve">Definir y justificar formalmente la versión de ISO/IEC 27001 empleada como base normativa del proyecto (2013 frente a 2022), documentando explícitamente el criterio adoptado.</w:t>
+        <w:t xml:space="preserve">Incorporar las pruebas automatizadas al pipeline de integración continua, que hoy solo compila los servicios.</w:t>
       </w:r>
     </w:p>
     <w:p>
@@ -6335,7 +5652,7 @@
         <w:jc w:val="both"/>
       </w:pPr>
       <w:r>
-        <w:t xml:space="preserve">A continuación se listan, en orden alfabético y con sangría francesa según normas APA 7.ª edición, las referencias efectivamente verificadas al momento de elaborar este documento. Los autores deben completar y validar las referencias marcadas como pendientes antes de la entrega final, incorporando el formato exacto (APA o IEEE) que exija el programa académico.</w:t>
+        <w:t xml:space="preserve">A continuación se listan las referencias citadas, en orden alfabético y con sangría francesa según las normas APA 7.ª edición.</w:t>
       </w:r>
     </w:p>
     <w:p>
@@ -6344,7 +5661,7 @@
         <w:jc w:val="both"/>
       </w:pPr>
       <w:r>
-        <w:t xml:space="preserve">International Organization for Standardization. (2013). ISO/IEC 27001:2013 — Information technology — Security techniques — Information security management systems — Requirements. [Referenciada como base normativa del instrumento MSPI en la documentación del proyecto].</w:t>
+        <w:t xml:space="preserve">Cockburn, A. (2005). Hexagonal architecture. https://alistair.cockburn.us/hexagonal-architecture/</w:t>
       </w:r>
     </w:p>
     <w:p>
@@ -6353,7 +5670,7 @@
         <w:jc w:val="both"/>
       </w:pPr>
       <w:r>
-        <w:t xml:space="preserve">[PENDIENTE: a completar por los autores] International Organization for Standardization. (2022). ISO/IEC 27001:2022 — Information security, cybersecurity and privacy protection — Information security management systems — Requirements.</w:t>
+        <w:t xml:space="preserve">Congreso de la República de Colombia. (2012, 17 de octubre). Ley Estatutaria 1581 de 2012, por la cual se dictan disposiciones generales para la protección de datos personales. Diario Oficial No. 48.587.</w:t>
       </w:r>
     </w:p>
     <w:p>
@@ -6362,7 +5679,7 @@
         <w:jc w:val="both"/>
       </w:pPr>
       <w:r>
-        <w:t xml:space="preserve">[PENDIENTE: a completar por los autores] National Institute of Standards and Technology. (Año exacto). Cybersecurity Framework (versión exacta empleada como referencia en el proyecto).</w:t>
+        <w:t xml:space="preserve">Eramba. (s.f.). Eramba: Open source GRC. https://www.eramba.org/</w:t>
       </w:r>
     </w:p>
     <w:p>
@@ -6371,7 +5688,7 @@
         <w:jc w:val="both"/>
       </w:pPr>
       <w:r>
-        <w:t xml:space="preserve">[PENDIENTE: a completar por los autores] Ministerio de Tecnologías de la Información y las Comunicaciones de Colombia. (Año). Modelo de Seguridad y Privacidad de la Información (MSPI) [circular, guía o resolución oficial que exige el diligenciamiento del instrumento].</w:t>
+        <w:t xml:space="preserve">Geers, M. (2020). Micro frontends in action. Manning.</w:t>
       </w:r>
     </w:p>
     <w:p>
@@ -6380,7 +5697,97 @@
         <w:jc w:val="both"/>
       </w:pPr>
       <w:r>
-        <w:t xml:space="preserve">[PENDIENTE: a completar por los autores] Referencias de literatura de arquitectura de software citada en el marco teórico (microservicios, arquitectura hexagonal/Clean Architecture, microfrontends), según lo efectivamente consultado por los autores.</w:t>
+        <w:t xml:space="preserve">International Organization for Standardization. (2013). ISO/IEC 27001:2013 Information technology — Security techniques — Information security management systems — Requirements.</w:t>
+      </w:r>
+    </w:p>
+    <w:p>
+      <w:pPr>
+        <w:ind w:left="709" w:hanging="709"/>
+        <w:jc w:val="both"/>
+      </w:pPr>
+      <w:r>
+        <w:t xml:space="preserve">International Organization for Standardization. (2022a). ISO/IEC 27001:2022 Information security, cybersecurity and privacy protection — Information security management systems — Requirements.</w:t>
+      </w:r>
+    </w:p>
+    <w:p>
+      <w:pPr>
+        <w:ind w:left="709" w:hanging="709"/>
+        <w:jc w:val="both"/>
+      </w:pPr>
+      <w:r>
+        <w:t xml:space="preserve">International Organization for Standardization. (2022b). ISO/IEC 27002:2022 Information security, cybersecurity and privacy protection — Information security controls.</w:t>
+      </w:r>
+    </w:p>
+    <w:p>
+      <w:pPr>
+        <w:ind w:left="709" w:hanging="709"/>
+        <w:jc w:val="both"/>
+      </w:pPr>
+      <w:r>
+        <w:t xml:space="preserve">Intuitem. (s.f.). CISO Assistant. https://intuitem.com/ciso-assistant/</w:t>
+      </w:r>
+    </w:p>
+    <w:p>
+      <w:pPr>
+        <w:ind w:left="709" w:hanging="709"/>
+        <w:jc w:val="both"/>
+      </w:pPr>
+      <w:r>
+        <w:t xml:space="preserve">Lewis, J., &amp; Fowler, M. (2014). Microservices. https://martinfowler.com/articles/microservices.html</w:t>
+      </w:r>
+    </w:p>
+    <w:p>
+      <w:pPr>
+        <w:ind w:left="709" w:hanging="709"/>
+        <w:jc w:val="both"/>
+      </w:pPr>
+      <w:r>
+        <w:t xml:space="preserve">Martin, R. C. (2017). Clean architecture: A craftsman's guide to software structure and design. Prentice Hall.</w:t>
+      </w:r>
+    </w:p>
+    <w:p>
+      <w:pPr>
+        <w:ind w:left="709" w:hanging="709"/>
+        <w:jc w:val="both"/>
+      </w:pPr>
+      <w:r>
+        <w:t xml:space="preserve">Ministerio de Tecnologías de la Información y las Comunicaciones. (2021). Resolución 00500 de 2021, por la cual se establecen los lineamientos y estándares para la estrategia de seguridad digital y se adopta el modelo de seguridad y privacidad como habilitador de la política de Gobierno Digital.</w:t>
+      </w:r>
+    </w:p>
+    <w:p>
+      <w:pPr>
+        <w:ind w:left="709" w:hanging="709"/>
+        <w:jc w:val="both"/>
+      </w:pPr>
+      <w:r>
+        <w:t xml:space="preserve">National Institute of Standards and Technology. (2024). The NIST Cybersecurity Framework (CSF) 2.0 (NIST CSWP 29). https://doi.org/10.6028/NIST.CSWP.29</w:t>
+      </w:r>
+    </w:p>
+    <w:p>
+      <w:pPr>
+        <w:ind w:left="709" w:hanging="709"/>
+        <w:jc w:val="both"/>
+      </w:pPr>
+      <w:r>
+        <w:t xml:space="preserve">Newman, S. (2021). Building microservices: Designing fine-grained systems (2.ª ed.). O'Reilly Media.</w:t>
+      </w:r>
+    </w:p>
+    <w:p>
+      <w:pPr>
+        <w:ind w:left="709" w:hanging="709"/>
+        <w:jc w:val="both"/>
+      </w:pPr>
+      <w:r>
+        <w:t xml:space="preserve">Richardson, C. (2018). Microservices patterns. Manning.</w:t>
+      </w:r>
+    </w:p>
+    <w:p>
+      <w:pPr>
+        <w:ind w:left="709" w:hanging="709"/>
+        <w:jc w:val="both"/>
+      </w:pPr>
+      <w:r>
+        <w:t xml:space="preserve">SimpleRisk. (s.f.). SimpleRisk: Enterprise risk management simplified. https://www.simplerisk.com/</w:t>
       </w:r>
     </w:p>
     <w:p>
@@ -6400,7 +5807,34 @@
         <w:jc w:val="both"/>
       </w:pPr>
       <w:r>
-        <w:t xml:space="preserve">[PENDIENTE: a completar por los autores] — anexar aquí material de soporte adicional (por ejemplo, capturas de pantalla del sistema, diagramas ampliados, actas de reunión con el asesor), si aplica.</w:t>
+        <w:t xml:space="preserve">Anexo A. Documentación técnica del sistema (arquitectura, modelo de datos con 73 tablas, referencia de los 156 servicios REST y documentación del ciclo de vida de cada microservicio y microfrontend), repositorio MSPI_NVA_CO_DOCS.</w:t>
+      </w:r>
+    </w:p>
+    <w:p>
+      <w:pPr>
+        <w:ind w:firstLine="709"/>
+        <w:jc w:val="both"/>
+      </w:pPr>
+      <w:r>
+        <w:t xml:space="preserve">Anexo B. Matriz de trazabilidad entre objetivos específicos, pantallas, servicios, tablas y pruebas (Documentacion-General/18-Matriz-Trazabilidad.md).</w:t>
+      </w:r>
+    </w:p>
+    <w:p>
+      <w:pPr>
+        <w:ind w:firstLine="709"/>
+        <w:jc w:val="both"/>
+      </w:pPr>
+      <w:r>
+        <w:t xml:space="preserve">Anexo C. Guía de 33 casos de prueba funcionales y manual de usuario (Documentacion-General/06 y 07).</w:t>
+      </w:r>
+    </w:p>
+    <w:p>
+      <w:pPr>
+        <w:ind w:firstLine="709"/>
+        <w:jc w:val="both"/>
+      </w:pPr>
+      <w:r>
+        <w:t xml:space="preserve">Anexo D. Marco legal: política de privacidad, términos de uso, autorización de tratamiento de datos y políticas de seguridad (carpeta legal/).</w:t>
       </w:r>
     </w:p>
     <w:sectPr>
@@ -6413,521 +5847,6 @@
     </w:sectPr>
   </w:body>
 </w:document>
-</file>
-
-<file path=word/comments.xml><?xml version="1.0" encoding="utf-8"?>
-<w:comments xmlns:wpc="http://schemas.microsoft.com/office/word/2010/wordprocessingCanvas" xmlns:cx="http://schemas.microsoft.com/office/drawing/2014/chartex" xmlns:cx1="http://schemas.microsoft.com/office/drawing/2015/9/8/chartex" xmlns:cx2="http://schemas.microsoft.com/office/drawing/2015/10/21/chartex" xmlns:cx3="http://schemas.microsoft.com/office/drawing/2016/5/9/chartex" xmlns:cx4="http://schemas.microsoft.com/office/drawing/2016/5/10/chartex" xmlns:cx5="http://schemas.microsoft.com/office/drawing/2016/5/11/chartex" xmlns:cx6="http://schemas.microsoft.com/office/drawing/2016/5/12/chartex" xmlns:cx7="http://schemas.microsoft.com/office/drawing/2016/5/13/chartex" xmlns:cx8="http://schemas.microsoft.com/office/drawing/2016/5/14/chartex" xmlns:mc="http://schemas.openxmlformats.org/markup-compatibility/2006" xmlns:aink="http://schemas.microsoft.com/office/drawing/2016/ink" xmlns:am3d="http://schemas.microsoft.com/office/drawing/2017/model3d" xmlns:o="urn:schemas-microsoft-com:office:office" xmlns:oel="http://schemas.microsoft.com/office/2019/extlst" xmlns:r="http://schemas.openxmlformats.org/officeDocument/2006/relationships" xmlns:m="http://schemas.openxmlformats.org/officeDocument/2006/math" xmlns:v="urn:schemas-microsoft-com:vml" xmlns:wp14="http://schemas.microsoft.com/office/word/2010/wordprocessingDrawing" xmlns:wp="http://schemas.openxmlformats.org/drawingml/2006/wordprocessingDrawing" xmlns:w10="urn:schemas-microsoft-com:office:word" xmlns:w="http://schemas.openxmlformats.org/wordprocessingml/2006/main" xmlns:w14="http://schemas.microsoft.com/office/word/2010/wordml" xmlns:w15="http://schemas.microsoft.com/office/word/2012/wordml" xmlns:w16cex="http://schemas.microsoft.com/office/word/2018/wordml/cex" xmlns:w16cid="http://schemas.microsoft.com/office/word/2016/wordml/cid" xmlns:w16="http://schemas.microsoft.com/office/word/2018/wordml" xmlns:w16du="http://schemas.microsoft.com/office/word/2023/wordml/word16du" xmlns:w16sdtdh="http://schemas.microsoft.com/office/word/2020/wordml/sdtdatahash" xmlns:w16se="http://schemas.microsoft.com/office/word/2015/wordml/symex" xmlns:wpg="http://schemas.microsoft.com/office/word/2010/wordprocessingGroup" xmlns:wpi="http://schemas.microsoft.com/office/word/2010/wordprocessingInk" xmlns:wne="http://schemas.microsoft.com/office/word/2006/wordml" xmlns:wps="http://schemas.microsoft.com/office/word/2010/wordprocessingShape" mc:Ignorable="w14 w15 w16se w16cid w16 w16cex w16sdtdh w16du wp14">
-  <w:comment w:id="0" w:author="Coordinador Editorial" w:date="2024-09-26T10:53:00Z" w:initials="E">
-    <w:p>
-      <w:pPr>
-        <w:pStyle w:val="Textocomentario"/>
-      </w:pPr>
-      <w:r>
-        <w:rPr>
-          <w:rStyle w:val="Refdecomentario"/>
-        </w:rPr>
-        <w:annotationRef/>
-      </w:r>
-      <w:r>
-        <w:t>La información entre corchetes debe diligenciarla.</w:t>
-      </w:r>
-    </w:p>
-  </w:comment>
-  <w:comment w:id="1" w:author="Coordinador Editorial" w:date="2024-09-26T10:53:00Z" w:initials="E">
-    <w:p>
-      <w:pPr>
-        <w:pStyle w:val="Textocomentario"/>
-      </w:pPr>
-      <w:r>
-        <w:rPr>
-          <w:rStyle w:val="Refdecomentario"/>
-        </w:rPr>
-        <w:annotationRef/>
-      </w:r>
-      <w:r>
-        <w:t>Agregue el número de estudiantes necesario.</w:t>
-      </w:r>
-    </w:p>
-  </w:comment>
-  <w:comment w:id="2" w:author="Coordinador Editorial" w:date="2024-10-02T18:18:00Z" w:initials="E">
-    <w:p>
-      <w:pPr>
-        <w:pStyle w:val="Textocomentario"/>
-      </w:pPr>
-      <w:r>
-        <w:rPr>
-          <w:rStyle w:val="Refdecomentario"/>
-        </w:rPr>
-        <w:annotationRef/>
-      </w:r>
-      <w:r>
-        <w:t>Si son dos autores:</w:t>
-      </w:r>
-      <w:r>
-        <w:br/>
-        <w:t>(Apellido &amp; Apellido, año)</w:t>
-      </w:r>
-      <w:r>
-        <w:br/>
-        <w:t>Ej. (Echeverry Vélez &amp; Vélez Robledo, 2018)</w:t>
-      </w:r>
-      <w:r>
-        <w:br/>
-      </w:r>
-    </w:p>
-    <w:p>
-      <w:pPr>
-        <w:pStyle w:val="Textocomentario"/>
-      </w:pPr>
-      <w:r>
-        <w:t>Si son tres o más autores:</w:t>
-      </w:r>
-      <w:r>
-        <w:br/>
-        <w:t>(Apellido de primer autor + et al., año)</w:t>
-      </w:r>
-      <w:r>
-        <w:br/>
-        <w:t>Ej. (Echeverry Vélez et al., 2018)</w:t>
-      </w:r>
-      <w:r>
-        <w:br/>
-      </w:r>
-    </w:p>
-  </w:comment>
-  <w:comment w:id="3" w:author="Autor" w:initials="A">
-    <w:p>
-      <w:pPr>
-        <w:pStyle w:val="Textocomentario"/>
-      </w:pPr>
-      <w:r>
-        <w:rPr>
-          <w:rStyle w:val="Refdecomentario"/>
-        </w:rPr>
-        <w:annotationRef/>
-      </w:r>
-      <w:r>
-        <w:t>Esta es la licencia sugerida para la publicación en el repositorio; sin embargo, los autores pueden seleccionar otra tipología: https://bit.ly/3aRY7Ry</w:t>
-      </w:r>
-    </w:p>
-  </w:comment>
-  <w:comment w:id="4" w:author="CTeI" w:date="2024-10-02T09:34:00Z" w:initials="CC">
-    <w:p>
-      <w:pPr>
-        <w:pStyle w:val="Textocomentario"/>
-      </w:pPr>
-      <w:r>
-        <w:rPr>
-          <w:rStyle w:val="Refdecomentario"/>
-        </w:rPr>
-        <w:annotationRef/>
-      </w:r>
-      <w:r>
-        <w:t>Elimine esta página y todas las demás indicaciones y orientaciones sobre cómo diligenciar este documento.</w:t>
-      </w:r>
-    </w:p>
-  </w:comment>
-  <w:comment w:id="5" w:author="Coordinador Editorial" w:date="2024-10-02T17:55:00Z" w:initials="E">
-    <w:p>
-      <w:pPr>
-        <w:pStyle w:val="Textocomentario"/>
-      </w:pPr>
-      <w:r>
-        <w:rPr>
-          <w:rStyle w:val="Refdecomentario"/>
-        </w:rPr>
-        <w:annotationRef/>
-      </w:r>
-      <w:r>
-        <w:t>Dedicatoria y agradecimientos solo aplica para el informe final, no para el proyecto, anteproyecto, propuesta.</w:t>
-      </w:r>
-    </w:p>
-  </w:comment>
-  <w:comment w:id="6" w:author="Coordinador Editorial" w:date="2024-09-27T15:33:00Z" w:initials="E">
-    <w:p>
-      <w:pPr>
-        <w:pStyle w:val="Textocomentario"/>
-      </w:pPr>
-      <w:r>
-        <w:rPr>
-          <w:rStyle w:val="Refdecomentario"/>
-        </w:rPr>
-        <w:annotationRef/>
-      </w:r>
-      <w:r>
-        <w:t>En negrilla, justificado, debajo del resumen. Replique la estructura en el abstract y las key words.</w:t>
-      </w:r>
-    </w:p>
-  </w:comment>
-  <w:comment w:id="7" w:author="Coordinador Editorial" w:date="2024-09-27T15:32:00Z" w:initials="E">
-    <w:p>
-      <w:pPr>
-        <w:pStyle w:val="Textocomentario"/>
-      </w:pPr>
-      <w:r>
-        <w:rPr>
-          <w:rStyle w:val="Refdecomentario"/>
-        </w:rPr>
-        <w:annotationRef/>
-      </w:r>
-      <w:r>
-        <w:t>Separe las palabras clave con comas. Estas deben ser precisas para describir su documento y facilitar encontrarlo en motores de búsqueda.</w:t>
-      </w:r>
-    </w:p>
-  </w:comment>
-  <w:comment w:id="8" w:author="Coordinador Editorial" w:date="2024-09-27T10:26:00Z" w:initials="E">
-    <w:p>
-      <w:pPr>
-        <w:pStyle w:val="Textocomentario"/>
-      </w:pPr>
-      <w:r>
-        <w:rPr>
-          <w:rStyle w:val="Refdecomentario"/>
-        </w:rPr>
-        <w:annotationRef/>
-      </w:r>
-      <w:r>
-        <w:t>Negrilla, centrado. Todos los títulos conservan el mismo tamaño de fuente del resto del documento.</w:t>
-      </w:r>
-    </w:p>
-  </w:comment>
-  <w:comment w:id="9" w:author="Coordinador Editorial" w:date="2024-09-27T10:28:00Z" w:initials="E">
-    <w:p>
-      <w:pPr>
-        <w:pStyle w:val="Textocomentario"/>
-      </w:pPr>
-      <w:r>
-        <w:rPr>
-          <w:rStyle w:val="Refdecomentario"/>
-        </w:rPr>
-        <w:annotationRef/>
-      </w:r>
-      <w:r>
-        <w:t>Negrilla, alineado a la izquierda, sin sangría.</w:t>
-      </w:r>
-    </w:p>
-  </w:comment>
-  <w:comment w:id="10" w:author="Coordinador Editorial" w:date="2024-09-27T10:28:00Z" w:initials="E">
-    <w:p>
-      <w:pPr>
-        <w:pStyle w:val="Textocomentario"/>
-      </w:pPr>
-      <w:r>
-        <w:rPr>
-          <w:rStyle w:val="Refdecomentario"/>
-        </w:rPr>
-        <w:annotationRef/>
-      </w:r>
-      <w:r>
-        <w:t>Negrilla, cursiva, alineado a la izquierda, sin sangría.</w:t>
-      </w:r>
-    </w:p>
-  </w:comment>
-  <w:comment w:id="11" w:author="Coordinador Editorial" w:date="2024-09-27T10:51:00Z" w:initials="E">
-    <w:p>
-      <w:pPr>
-        <w:pStyle w:val="Textocomentario"/>
-      </w:pPr>
-      <w:r>
-        <w:rPr>
-          <w:rStyle w:val="Refdecomentario"/>
-        </w:rPr>
-        <w:annotationRef/>
-      </w:r>
-      <w:r>
-        <w:t>Negrilla, justificado, con sangría de 1,27 cm, punto al final. Después del punto, el texto continúa, pues forma parte del párrafo.</w:t>
-      </w:r>
-    </w:p>
-  </w:comment>
-  <w:comment w:id="12" w:author="Coordinador Editorial" w:date="2024-09-27T10:53:00Z" w:initials="E">
-    <w:p>
-      <w:pPr>
-        <w:pStyle w:val="Textocomentario"/>
-      </w:pPr>
-      <w:r>
-        <w:rPr>
-          <w:rStyle w:val="Refdecomentario"/>
-        </w:rPr>
-        <w:annotationRef/>
-      </w:r>
-      <w:r>
-        <w:t>Negrilla, cursiva, justificado, con sangría de 1,27 cm, punto al final. Después del punto, el texto continúa, pues forma parte del párrafo.</w:t>
-      </w:r>
-    </w:p>
-  </w:comment>
-  <w:comment w:id="14" w:author="Coordinador Editorial" w:date="2024-09-27T11:18:00Z" w:initials="E">
-    <w:p>
-      <w:pPr>
-        <w:pStyle w:val="Textocomentario"/>
-      </w:pPr>
-      <w:r>
-        <w:rPr>
-          <w:rStyle w:val="Refdecomentario"/>
-        </w:rPr>
-        <w:annotationRef/>
-      </w:r>
-      <w:r>
-        <w:t xml:space="preserve">Puede variar el tamaño de la fuente (no el tipo) y características como negrillas, subrayado, cursivas, interlineado para facilitar la lectura e interpretación de la tabla. </w:t>
-      </w:r>
-    </w:p>
-  </w:comment>
-  <w:comment w:id="19" w:author="Coordinador Editorial" w:date="2024-10-02T18:03:00Z" w:initials="E">
-    <w:p>
-      <w:pPr>
-        <w:pStyle w:val="Textocomentario"/>
-      </w:pPr>
-      <w:r>
-        <w:rPr>
-          <w:rStyle w:val="Refdecomentario"/>
-        </w:rPr>
-        <w:annotationRef/>
-      </w:r>
-      <w:r>
-        <w:t>El nombre de la figura se escribe sin negrilla, en cursiva, alineado a la izquierda, debajo del número de la tabla.</w:t>
-      </w:r>
-    </w:p>
-  </w:comment>
-  <w:comment w:id="20" w:author="Coordinador Editorial" w:date="2024-09-27T12:02:00Z" w:initials="E">
-    <w:p>
-      <w:pPr>
-        <w:pStyle w:val="Textocomentario"/>
-      </w:pPr>
-      <w:r>
-        <w:rPr>
-          <w:rStyle w:val="Refdecomentario"/>
-        </w:rPr>
-        <w:annotationRef/>
-      </w:r>
-      <w:r>
-        <w:t>Si hay alguna aclaración, escriba “</w:t>
-      </w:r>
-      <w:r>
-        <w:rPr>
-          <w:i/>
-          <w:iCs/>
-        </w:rPr>
-        <w:t>Nota.</w:t>
-      </w:r>
-      <w:r>
-        <w:t xml:space="preserve">” en cursiva, sin negrilla, alineado a la izquierda, con la misma fuente que el resto del texto en la línea después de la figura, con un punto seguido. </w:t>
-      </w:r>
-    </w:p>
-  </w:comment>
-  <w:comment w:id="21" w:author="Coordinador Editorial" w:date="2024-10-02T18:12:00Z" w:initials="E">
-    <w:p>
-      <w:pPr>
-        <w:pStyle w:val="Textocomentario"/>
-      </w:pPr>
-      <w:r>
-        <w:rPr>
-          <w:rStyle w:val="Refdecomentario"/>
-        </w:rPr>
-        <w:annotationRef/>
-      </w:r>
-      <w:r>
-        <w:t>Agregue las que usa en su texto.</w:t>
-      </w:r>
-    </w:p>
-  </w:comment>
-  <w:comment w:id="45" w:author="Coordinador Editorial" w:date="2024-09-30T17:31:00Z" w:initials="E">
-    <w:p>
-      <w:pPr>
-        <w:pStyle w:val="Textocomentario"/>
-      </w:pPr>
-      <w:r>
-        <w:rPr>
-          <w:rStyle w:val="Refdecomentario"/>
-        </w:rPr>
-        <w:annotationRef/>
-      </w:r>
-      <w:r>
-        <w:t>Solo se escriben las iniciales de los nombres.</w:t>
-      </w:r>
-    </w:p>
-  </w:comment>
-  <w:comment w:id="46" w:author="Coordinador Editorial" w:date="2024-09-30T17:40:00Z" w:initials="E">
-    <w:p>
-      <w:pPr>
-        <w:pStyle w:val="Textocomentario"/>
-      </w:pPr>
-      <w:r>
-        <w:rPr>
-          <w:rStyle w:val="Refdecomentario"/>
-        </w:rPr>
-        <w:annotationRef/>
-      </w:r>
-      <w:r>
-        <w:t>Separe los nombres y apellidos de los autores con comas.</w:t>
-      </w:r>
-    </w:p>
-  </w:comment>
-  <w:comment w:id="47" w:author="Coordinador Editorial" w:date="2024-09-30T17:34:00Z" w:initials="E">
-    <w:p>
-      <w:pPr>
-        <w:pStyle w:val="Textocomentario"/>
-      </w:pPr>
-      <w:r>
-        <w:rPr>
-          <w:rStyle w:val="Refdecomentario"/>
-        </w:rPr>
-        <w:annotationRef/>
-      </w:r>
-      <w:r>
-        <w:t>Si es un libro digital, agregue el enlace después de este punto.</w:t>
-      </w:r>
-    </w:p>
-  </w:comment>
-  <w:comment w:id="48" w:author="Coordinador Editorial" w:date="2024-09-30T17:42:00Z" w:initials="E">
-    <w:p>
-      <w:pPr>
-        <w:pStyle w:val="Textocomentario"/>
-      </w:pPr>
-      <w:r>
-        <w:rPr>
-          <w:rStyle w:val="Refdecomentario"/>
-        </w:rPr>
-        <w:annotationRef/>
-      </w:r>
-      <w:r>
-        <w:t>El paréntesis va pegado al número del volumen.</w:t>
-      </w:r>
-    </w:p>
-  </w:comment>
-  <w:comment w:id="49" w:author="Coordinador Editorial" w:date="2024-09-30T17:55:00Z" w:initials="E">
-    <w:p>
-      <w:pPr>
-        <w:pStyle w:val="Textocomentario"/>
-      </w:pPr>
-      <w:r>
-        <w:rPr>
-          <w:rStyle w:val="Refdecomentario"/>
-        </w:rPr>
-        <w:annotationRef/>
-      </w:r>
-      <w:r>
-        <w:t>Según aplique.</w:t>
-      </w:r>
-    </w:p>
-  </w:comment>
-  <w:comment w:id="50" w:author="Coordinador Editorial" w:date="2024-09-30T17:58:00Z" w:initials="E">
-    <w:p>
-      <w:pPr>
-        <w:pStyle w:val="Textocomentario"/>
-      </w:pPr>
-      <w:r>
-        <w:rPr>
-          <w:rStyle w:val="Refdecomentario"/>
-        </w:rPr>
-        <w:annotationRef/>
-      </w:r>
-      <w:r>
-        <w:t>Esto debe ir entre corchetes. Los otros corchetes significan que la información debe diligenciarse.</w:t>
-      </w:r>
-    </w:p>
-  </w:comment>
-  <w:comment w:id="51" w:author="Coordinador Editorial" w:date="2024-09-30T18:06:00Z" w:initials="E">
-    <w:p>
-      <w:pPr>
-        <w:pStyle w:val="Textocomentario"/>
-      </w:pPr>
-      <w:r>
-        <w:rPr>
-          <w:rStyle w:val="Refdecomentario"/>
-        </w:rPr>
-        <w:annotationRef/>
-      </w:r>
-      <w:r>
-        <w:t>También existen los autores corporativos.</w:t>
-      </w:r>
-    </w:p>
-  </w:comment>
-</w:comments>
-</file>
-
-<file path=word/commentsExtended.xml><?xml version="1.0" encoding="utf-8"?>
-<w15:commentsEx xmlns:wpc="http://schemas.microsoft.com/office/word/2010/wordprocessingCanvas" xmlns:cx="http://schemas.microsoft.com/office/drawing/2014/chartex" xmlns:cx1="http://schemas.microsoft.com/office/drawing/2015/9/8/chartex" xmlns:cx2="http://schemas.microsoft.com/office/drawing/2015/10/21/chartex" xmlns:cx3="http://schemas.microsoft.com/office/drawing/2016/5/9/chartex" xmlns:cx4="http://schemas.microsoft.com/office/drawing/2016/5/10/chartex" xmlns:cx5="http://schemas.microsoft.com/office/drawing/2016/5/11/chartex" xmlns:cx6="http://schemas.microsoft.com/office/drawing/2016/5/12/chartex" xmlns:cx7="http://schemas.microsoft.com/office/drawing/2016/5/13/chartex" xmlns:cx8="http://schemas.microsoft.com/office/drawing/2016/5/14/chartex" xmlns:mc="http://schemas.openxmlformats.org/markup-compatibility/2006" xmlns:aink="http://schemas.microsoft.com/office/drawing/2016/ink" xmlns:am3d="http://schemas.microsoft.com/office/drawing/2017/model3d" xmlns:o="urn:schemas-microsoft-com:office:office" xmlns:oel="http://schemas.microsoft.com/office/2019/extlst" xmlns:r="http://schemas.openxmlformats.org/officeDocument/2006/relationships" xmlns:m="http://schemas.openxmlformats.org/officeDocument/2006/math" xmlns:v="urn:schemas-microsoft-com:vml" xmlns:wp14="http://schemas.microsoft.com/office/word/2010/wordprocessingDrawing" xmlns:wp="http://schemas.openxmlformats.org/drawingml/2006/wordprocessingDrawing" xmlns:w10="urn:schemas-microsoft-com:office:word" xmlns:w="http://schemas.openxmlformats.org/wordprocessingml/2006/main" xmlns:w14="http://schemas.microsoft.com/office/word/2010/wordml" xmlns:w15="http://schemas.microsoft.com/office/word/2012/wordml" xmlns:w16cex="http://schemas.microsoft.com/office/word/2018/wordml/cex" xmlns:w16cid="http://schemas.microsoft.com/office/word/2016/wordml/cid" xmlns:w16="http://schemas.microsoft.com/office/word/2018/wordml" xmlns:w16du="http://schemas.microsoft.com/office/word/2023/wordml/word16du" xmlns:w16sdtdh="http://schemas.microsoft.com/office/word/2020/wordml/sdtdatahash" xmlns:w16se="http://schemas.microsoft.com/office/word/2015/wordml/symex" xmlns:wpg="http://schemas.microsoft.com/office/word/2010/wordprocessingGroup" xmlns:wpi="http://schemas.microsoft.com/office/word/2010/wordprocessingInk" xmlns:wne="http://schemas.microsoft.com/office/word/2006/wordml" xmlns:wps="http://schemas.microsoft.com/office/word/2010/wordprocessingShape" mc:Ignorable="w14 w15 w16se w16cid w16 w16cex w16sdtdh w16du wp14">
-  <w15:commentEx w15:paraId="00642AD8" w15:done="0"/>
-  <w15:commentEx w15:paraId="1DCC42F0" w15:done="0"/>
-  <w15:commentEx w15:paraId="41CDD246" w15:done="0"/>
-  <w15:commentEx w15:paraId="2E984E24" w15:done="0"/>
-  <w15:commentEx w15:paraId="558C00C5" w15:done="0"/>
-  <w15:commentEx w15:paraId="14CCDB2D" w15:done="0"/>
-  <w15:commentEx w15:paraId="7DDE6E33" w15:done="0"/>
-  <w15:commentEx w15:paraId="5936A8AA" w15:done="0"/>
-  <w15:commentEx w15:paraId="4603E837" w15:done="0"/>
-  <w15:commentEx w15:paraId="1E0B2B28" w15:done="0"/>
-  <w15:commentEx w15:paraId="5EA99CFD" w15:done="0"/>
-  <w15:commentEx w15:paraId="690B9E47" w15:done="0"/>
-  <w15:commentEx w15:paraId="0E04E0C4" w15:done="0"/>
-  <w15:commentEx w15:paraId="0F7A639E" w15:done="0"/>
-  <w15:commentEx w15:paraId="00EC4F91" w15:done="0"/>
-  <w15:commentEx w15:paraId="007CDA6F" w15:done="0"/>
-  <w15:commentEx w15:paraId="35F2F522" w15:done="0"/>
-  <w15:commentEx w15:paraId="0DABF2FF" w15:done="0"/>
-  <w15:commentEx w15:paraId="7A8C57EC" w15:done="0"/>
-  <w15:commentEx w15:paraId="122ABA2E" w15:done="0"/>
-  <w15:commentEx w15:paraId="75C60612" w15:done="0"/>
-  <w15:commentEx w15:paraId="33378D28" w15:done="0"/>
-  <w15:commentEx w15:paraId="7AF3306E" w15:done="0"/>
-  <w15:commentEx w15:paraId="617387F8" w15:done="0"/>
-</w15:commentsEx>
-</file>
-
-<file path=word/commentsExtensible.xml><?xml version="1.0" encoding="utf-8"?>
-<w16cex:commentsExtensible xmlns:wpc="http://schemas.microsoft.com/office/word/2010/wordprocessingCanvas" xmlns:cx="http://schemas.microsoft.com/office/drawing/2014/chartex" xmlns:cx1="http://schemas.microsoft.com/office/drawing/2015/9/8/chartex" xmlns:cx2="http://schemas.microsoft.com/office/drawing/2015/10/21/chartex" xmlns:cx3="http://schemas.microsoft.com/office/drawing/2016/5/9/chartex" xmlns:cx4="http://schemas.microsoft.com/office/drawing/2016/5/10/chartex" xmlns:cx5="http://schemas.microsoft.com/office/drawing/2016/5/11/chartex" xmlns:cx6="http://schemas.microsoft.com/office/drawing/2016/5/12/chartex" xmlns:cx7="http://schemas.microsoft.com/office/drawing/2016/5/13/chartex" xmlns:cx8="http://schemas.microsoft.com/office/drawing/2016/5/14/chartex" xmlns:cr="http://schemas.microsoft.com/office/comments/2020/reactions" xmlns:mc="http://schemas.openxmlformats.org/markup-compatibility/2006" xmlns:aink="http://schemas.microsoft.com/office/drawing/2016/ink" xmlns:am3d="http://schemas.microsoft.com/office/drawing/2017/model3d" xmlns:o="urn:schemas-microsoft-com:office:office" xmlns:oel="http://schemas.microsoft.com/office/2019/extlst" xmlns:r="http://schemas.openxmlformats.org/officeDocument/2006/relationships" xmlns:m="http://schemas.openxmlformats.org/officeDocument/2006/math" xmlns:v="urn:schemas-microsoft-com:vml" xmlns:wp14="http://schemas.microsoft.com/office/word/2010/wordprocessingDrawing" xmlns:wp="http://schemas.openxmlformats.org/drawingml/2006/wordprocessingDrawing" xmlns:w10="urn:schemas-microsoft-com:office:word" xmlns:w="http://schemas.openxmlformats.org/wordprocessingml/2006/main" xmlns:w14="http://schemas.microsoft.com/office/word/2010/wordml" xmlns:w15="http://schemas.microsoft.com/office/word/2012/wordml" xmlns:w16cex="http://schemas.microsoft.com/office/word/2018/wordml/cex" xmlns:w16cid="http://schemas.microsoft.com/office/word/2016/wordml/cid" xmlns:w16="http://schemas.microsoft.com/office/word/2018/wordml" xmlns:w16du="http://schemas.microsoft.com/office/word/2023/wordml/word16du" xmlns:w16sdtdh="http://schemas.microsoft.com/office/word/2020/wordml/sdtdatahash" xmlns:w16se="http://schemas.microsoft.com/office/word/2015/wordml/symex" xmlns:wpg="http://schemas.microsoft.com/office/word/2010/wordprocessingGroup" xmlns:wpi="http://schemas.microsoft.com/office/word/2010/wordprocessingInk" xmlns:wne="http://schemas.microsoft.com/office/word/2006/wordml" xmlns:wps="http://schemas.microsoft.com/office/word/2010/wordprocessingShape" mc:Ignorable="w14 w15 w16se w16cid w16 w16cex w16sdtdh cr w16du wp14">
-  <w16cex:commentExtensible w16cex:durableId="2F2F185A" w16cex:dateUtc="2024-09-26T15:53:00Z"/>
-  <w16cex:commentExtensible w16cex:durableId="6FFBC428" w16cex:dateUtc="2024-09-26T15:53:00Z"/>
-  <w16cex:commentExtensible w16cex:durableId="2D43E395" w16cex:dateUtc="2024-10-02T23:18:00Z"/>
-  <w16cex:commentExtensible w16cex:durableId="57550456" w16cex:dateUtc="2024-10-02T14:34:00Z"/>
-  <w16cex:commentExtensible w16cex:durableId="6B4388D5" w16cex:dateUtc="2024-10-02T22:55:00Z"/>
-  <w16cex:commentExtensible w16cex:durableId="59EEA801" w16cex:dateUtc="2024-09-27T20:33:00Z"/>
-  <w16cex:commentExtensible w16cex:durableId="4267058E" w16cex:dateUtc="2024-09-27T20:32:00Z"/>
-  <w16cex:commentExtensible w16cex:durableId="15010DFE" w16cex:dateUtc="2024-09-27T15:26:00Z"/>
-  <w16cex:commentExtensible w16cex:durableId="00EF8863" w16cex:dateUtc="2024-09-27T15:28:00Z"/>
-  <w16cex:commentExtensible w16cex:durableId="579FAD20" w16cex:dateUtc="2024-09-27T15:28:00Z"/>
-  <w16cex:commentExtensible w16cex:durableId="6568290F" w16cex:dateUtc="2024-09-27T15:51:00Z"/>
-  <w16cex:commentExtensible w16cex:durableId="292B2353" w16cex:dateUtc="2024-09-27T15:53:00Z"/>
-  <w16cex:commentExtensible w16cex:durableId="57B8A5C3" w16cex:dateUtc="2024-09-27T16:18:00Z"/>
-  <w16cex:commentExtensible w16cex:durableId="2F8F698A" w16cex:dateUtc="2024-10-02T23:03:00Z"/>
-  <w16cex:commentExtensible w16cex:durableId="1894BB01" w16cex:dateUtc="2024-09-27T17:02:00Z"/>
-  <w16cex:commentExtensible w16cex:durableId="5F9A8B0C" w16cex:dateUtc="2024-10-02T23:12:00Z"/>
-  <w16cex:commentExtensible w16cex:durableId="3DF2801F" w16cex:dateUtc="2024-09-30T22:31:00Z"/>
-  <w16cex:commentExtensible w16cex:durableId="4C01EE86" w16cex:dateUtc="2024-09-30T22:40:00Z"/>
-  <w16cex:commentExtensible w16cex:durableId="61D72EF8" w16cex:dateUtc="2024-09-30T22:34:00Z"/>
-  <w16cex:commentExtensible w16cex:durableId="57D968AC" w16cex:dateUtc="2024-09-30T22:42:00Z"/>
-  <w16cex:commentExtensible w16cex:durableId="49ED36BA" w16cex:dateUtc="2024-09-30T22:55:00Z"/>
-  <w16cex:commentExtensible w16cex:durableId="015BCF10" w16cex:dateUtc="2024-09-30T22:58:00Z"/>
-  <w16cex:commentExtensible w16cex:durableId="057ACB48" w16cex:dateUtc="2024-09-30T23:06:00Z"/>
-</w16cex:commentsExtensible>
-</file>
-
-<file path=word/commentsIds.xml><?xml version="1.0" encoding="utf-8"?>
-<w16cid:commentsIds xmlns:wpc="http://schemas.microsoft.com/office/word/2010/wordprocessingCanvas" xmlns:cx="http://schemas.microsoft.com/office/drawing/2014/chartex" xmlns:cx1="http://schemas.microsoft.com/office/drawing/2015/9/8/chartex" xmlns:cx2="http://schemas.microsoft.com/office/drawing/2015/10/21/chartex" xmlns:cx3="http://schemas.microsoft.com/office/drawing/2016/5/9/chartex" xmlns:cx4="http://schemas.microsoft.com/office/drawing/2016/5/10/chartex" xmlns:cx5="http://schemas.microsoft.com/office/drawing/2016/5/11/chartex" xmlns:cx6="http://schemas.microsoft.com/office/drawing/2016/5/12/chartex" xmlns:cx7="http://schemas.microsoft.com/office/drawing/2016/5/13/chartex" xmlns:cx8="http://schemas.microsoft.com/office/drawing/2016/5/14/chartex" xmlns:mc="http://schemas.openxmlformats.org/markup-compatibility/2006" xmlns:aink="http://schemas.microsoft.com/office/drawing/2016/ink" xmlns:am3d="http://schemas.microsoft.com/office/drawing/2017/model3d" xmlns:o="urn:schemas-microsoft-com:office:office" xmlns:oel="http://schemas.microsoft.com/office/2019/extlst" xmlns:r="http://schemas.openxmlformats.org/officeDocument/2006/relationships" xmlns:m="http://schemas.openxmlformats.org/officeDocument/2006/math" xmlns:v="urn:schemas-microsoft-com:vml" xmlns:wp14="http://schemas.microsoft.com/office/word/2010/wordprocessingDrawing" xmlns:wp="http://schemas.openxmlformats.org/drawingml/2006/wordprocessingDrawing" xmlns:w10="urn:schemas-microsoft-com:office:word" xmlns:w="http://schemas.openxmlformats.org/wordprocessingml/2006/main" xmlns:w14="http://schemas.microsoft.com/office/word/2010/wordml" xmlns:w15="http://schemas.microsoft.com/office/word/2012/wordml" xmlns:w16cex="http://schemas.microsoft.com/office/word/2018/wordml/cex" xmlns:w16cid="http://schemas.microsoft.com/office/word/2016/wordml/cid" xmlns:w16="http://schemas.microsoft.com/office/word/2018/wordml" xmlns:w16du="http://schemas.microsoft.com/office/word/2023/wordml/word16du" xmlns:w16sdtdh="http://schemas.microsoft.com/office/word/2020/wordml/sdtdatahash" xmlns:w16se="http://schemas.microsoft.com/office/word/2015/wordml/symex" xmlns:wpg="http://schemas.microsoft.com/office/word/2010/wordprocessingGroup" xmlns:wpi="http://schemas.microsoft.com/office/word/2010/wordprocessingInk" xmlns:wne="http://schemas.microsoft.com/office/word/2006/wordml" xmlns:wps="http://schemas.microsoft.com/office/word/2010/wordprocessingShape" mc:Ignorable="w14 w15 w16se w16cid w16 w16cex w16sdtdh w16du wp14">
-  <w16cid:commentId w16cid:paraId="00642AD8" w16cid:durableId="2F2F185A"/>
-  <w16cid:commentId w16cid:paraId="1DCC42F0" w16cid:durableId="6FFBC428"/>
-  <w16cid:commentId w16cid:paraId="41CDD246" w16cid:durableId="2D43E395"/>
-  <w16cid:commentId w16cid:paraId="2E984E24" w16cid:durableId="2338204D"/>
-  <w16cid:commentId w16cid:paraId="558C00C5" w16cid:durableId="57550456"/>
-  <w16cid:commentId w16cid:paraId="14CCDB2D" w16cid:durableId="6B4388D5"/>
-  <w16cid:commentId w16cid:paraId="7DDE6E33" w16cid:durableId="59EEA801"/>
-  <w16cid:commentId w16cid:paraId="5936A8AA" w16cid:durableId="4267058E"/>
-  <w16cid:commentId w16cid:paraId="4603E837" w16cid:durableId="15010DFE"/>
-  <w16cid:commentId w16cid:paraId="1E0B2B28" w16cid:durableId="00EF8863"/>
-  <w16cid:commentId w16cid:paraId="5EA99CFD" w16cid:durableId="579FAD20"/>
-  <w16cid:commentId w16cid:paraId="690B9E47" w16cid:durableId="6568290F"/>
-  <w16cid:commentId w16cid:paraId="0E04E0C4" w16cid:durableId="292B2353"/>
-  <w16cid:commentId w16cid:paraId="0F7A639E" w16cid:durableId="57B8A5C3"/>
-  <w16cid:commentId w16cid:paraId="00EC4F91" w16cid:durableId="2F8F698A"/>
-  <w16cid:commentId w16cid:paraId="007CDA6F" w16cid:durableId="1894BB01"/>
-  <w16cid:commentId w16cid:paraId="35F2F522" w16cid:durableId="5F9A8B0C"/>
-  <w16cid:commentId w16cid:paraId="0DABF2FF" w16cid:durableId="3DF2801F"/>
-  <w16cid:commentId w16cid:paraId="7A8C57EC" w16cid:durableId="4C01EE86"/>
-  <w16cid:commentId w16cid:paraId="122ABA2E" w16cid:durableId="61D72EF8"/>
-  <w16cid:commentId w16cid:paraId="75C60612" w16cid:durableId="57D968AC"/>
-  <w16cid:commentId w16cid:paraId="33378D28" w16cid:durableId="49ED36BA"/>
-  <w16cid:commentId w16cid:paraId="7AF3306E" w16cid:durableId="015BCF10"/>
-  <w16cid:commentId w16cid:paraId="617387F8" w16cid:durableId="057ACB48"/>
-</w16cid:commentsIds>
 </file>
 
 <file path=word/endnotes.xml><?xml version="1.0" encoding="utf-8"?>

</xml_diff>

<commit_message>
docs: fix stale CI statements and refresh project figures in index, matrix, README and proposal
</commit_message>
<xml_diff>
--- a/Propuesta-grado/Propuesta_de_Grado_MSPI.docx
+++ b/Propuesta-grado/Propuesta_de_Grado_MSPI.docx
@@ -1277,7 +1277,7 @@
         <w:jc w:val="both"/>
       </w:pPr>
       <w:r>
-        <w:t xml:space="preserve">Las entidades públicas colombianas deben evaluar periódicamente su nivel de madurez en seguridad de la información con base en el Instrumento de Identificación de la Línea Base de Seguridad del Modelo de Seguridad y Privacidad de la Información (MSPI) de MinTIC, fundamentado en el Anexo A de ISO/IEC 27001, el ciclo PHVA (Planificar-Hacer-Verificar-Actuar) y el marco NIST CSF 2.0. Actualmente este instrumento se diligencia de forma manual en una hoja de cálculo de nueve hojas, lo que genera errores de cálculo, ausencia de trazabilidad de evidencias, falta de control de acceso diferenciado y nula comparabilidad histórica entre evaluaciones. Este proyecto de grado presenta el diseño y la implementación de MSPI, una plataforma de software basada en arquitectura de microservicios (backend en Java/Spring Boot con arquitectura hexagonal) y microfrontends (frontend en Angular), que automatiza el instrumento completo: levantamiento de información, asignación de áreas y responsables, calificación de controles administrativos y técnicos del Anexo A, cálculo ponderado del avance PHVA, determinación del nivel de madurez del SGSI, evaluación frente a NIST CSF, gestión de evidencias documentales, identidad y control de acceso basado en roles, y generación de reportes. El sistema se compone de ocho microservicios (ms_iam, ms_org, ms_catalog, ms_assessment, ms_evidence, ms_reporting, ms_audit y ms_admin) y seis microfrontends (mf_shell, mf_auth, mf_org, mf_assessment, mf_evidence y mf_reports), desplegados con Docker y respaldados por PostgreSQL y Keycloak. La metodología de desarrollo siguió un enfoque ágil iterativo-incremental organizado en ocho sprints, y la investigación se sitúa en el tipo aplicado o tecnológico, con un enfoque predominantemente cualitativo (análisis del proceso manual existente y diseño de la solución) complementado con verificación cuantitativa de las fórmulas de cálculo del instrumento. Entre los principales resultados se destaca la implementación funcional de los ocho microservicios (156 servicios REST sobre un modelo de 73 tablas) y de los seis microfrontends, con auditoría centralizada, solicitudes aprobables con radicado y borrado lógico, así como la identificación de limitaciones para el trabajo futuro, entre ellas la cobertura de pruebas automatizadas heterogénea entre backend y frontend y la preparación del frontend para un despliegue productivo. El proyecto demuestra la viabilidad técnica de digitalizar un instrumento regulatorio de seguridad de la información colombiano mediante una arquitectura moderna, distribuida y trazable, sentando una base reutilizable para futuras entidades públicas que deban adoptar el modelo MSPI.</w:t>
+        <w:t xml:space="preserve">Las entidades públicas colombianas deben evaluar periódicamente su nivel de madurez en seguridad de la información con base en el Instrumento de Identificación de la Línea Base de Seguridad del Modelo de Seguridad y Privacidad de la Información (MSPI) de MinTIC, fundamentado en el Anexo A de ISO/IEC 27001, el ciclo PHVA (Planificar-Hacer-Verificar-Actuar) y el marco NIST CSF 2.0. Actualmente este instrumento se diligencia de forma manual en una hoja de cálculo de nueve hojas, lo que genera errores de cálculo, ausencia de trazabilidad de evidencias, falta de control de acceso diferenciado y nula comparabilidad histórica entre evaluaciones. Este proyecto de grado presenta el diseño y la implementación de MSPI, una plataforma de software basada en arquitectura de microservicios (backend en Java/Spring Boot con arquitectura hexagonal) y microfrontends (frontend en Angular), que automatiza el instrumento completo: levantamiento de información, asignación de áreas y responsables, calificación de controles administrativos y técnicos del Anexo A, cálculo ponderado del avance PHVA, determinación del nivel de madurez del SGSI, evaluación frente a NIST CSF, gestión de evidencias documentales, identidad y control de acceso basado en roles, y generación de reportes. El sistema se compone de ocho microservicios (ms_iam, ms_org, ms_catalog, ms_assessment, ms_evidence, ms_reporting, ms_audit y ms_admin) y seis microfrontends (mf_shell, mf_auth, mf_org, mf_assessment, mf_evidence y mf_reports), desplegados con Docker y respaldados por PostgreSQL y Keycloak. La metodología de desarrollo siguió un enfoque ágil iterativo-incremental organizado en ocho sprints, y la investigación se sitúa en el tipo aplicado o tecnológico, con un enfoque predominantemente cualitativo (análisis del proceso manual existente y diseño de la solución) complementado con verificación cuantitativa de las fórmulas de cálculo del instrumento. Entre los principales resultados se destaca la implementación funcional de los ocho microservicios (158 servicios REST sobre un modelo de 74 tablas) y de los seis microfrontends, con auditoría centralizada, solicitudes aprobables con radicado y borrado lógico, así como la identificación de limitaciones para el trabajo futuro, entre ellas la cobertura de pruebas automatizadas heterogénea entre backend y frontend y la preparación del frontend para un despliegue productivo. El proyecto demuestra la viabilidad técnica de digitalizar un instrumento regulatorio de seguridad de la información colombiano mediante una arquitectura moderna, distribuida y trazable, sentando una base reutilizable para futuras entidades públicas que deban adoptar el modelo MSPI.</w:t>
       </w:r>
     </w:p>
     <w:p>
@@ -1313,7 +1313,7 @@
         <w:jc w:val="both"/>
       </w:pPr>
       <w:r>
-        <w:t xml:space="preserve">Colombian public entities are required to periodically assess their information security maturity level using the Security Baseline Identification Instrument of MinTIC's Information Security and Privacy Model (MSPI), grounded in Annex A of ISO/IEC 27001, the PDCA cycle (Plan-Do-Check-Act) and the NIST Cybersecurity Framework 2.0. This instrument is currently filled out manually in a nine-sheet spreadsheet, which leads to calculation errors, lack of evidence traceability, absence of role-based access control and no historical comparability between assessments. This undergraduate thesis presents the design and implementation of MSPI, a software platform based on a microservices architecture (Java/Spring Boot backend with hexagonal architecture) and micro-frontends (Angular frontend), that automates the full instrument: information gathering, area and responsible-party assignment, scoring of administrative and technical Annex A controls, weighted PDCA progress calculation, SGSI maturity level determination, NIST CSF evaluation, documentary evidence management, identity and role-based access control, and report generation. The system comprises eight microservices (ms_iam, ms_org, ms_catalog, ms_assessment, ms_evidence, ms_reporting, ms_audit and ms_admin) and six micro-frontends (mf_shell, mf_auth, mf_org, mf_assessment, mf_evidence and mf_reports), deployed with Docker and backed by PostgreSQL and Keycloak. The development approach followed an agile, iterative-incremental process organized in eight sprints, and the research is classified as applied/technological, predominantly qualitative, complemented with quantitative verification of the instrument's calculation formulas. Key results include the functional implementation of all eight microservices (156 REST endpoints over a 73-table data model) and all six micro-frontends, with centralized auditing, approval-based requests with tracking numbers and logical deletion, as well as the identification of limitations for future work, such as uneven automated test coverage between backend and frontend and preparing the frontend for production deployment. The project demonstrates the technical feasibility of digitizing a Colombian information-security regulatory instrument through a modern, distributed and traceable architecture, laying a reusable foundation for other public entities that must adopt the MSPI model.</w:t>
+        <w:t xml:space="preserve">Colombian public entities are required to periodically assess their information security maturity level using the Security Baseline Identification Instrument of MinTIC's Information Security and Privacy Model (MSPI), grounded in Annex A of ISO/IEC 27001, the PDCA cycle (Plan-Do-Check-Act) and the NIST Cybersecurity Framework 2.0. This instrument is currently filled out manually in a nine-sheet spreadsheet, which leads to calculation errors, lack of evidence traceability, absence of role-based access control and no historical comparability between assessments. This undergraduate thesis presents the design and implementation of MSPI, a software platform based on a microservices architecture (Java/Spring Boot backend with hexagonal architecture) and micro-frontends (Angular frontend), that automates the full instrument: information gathering, area and responsible-party assignment, scoring of administrative and technical Annex A controls, weighted PDCA progress calculation, SGSI maturity level determination, NIST CSF evaluation, documentary evidence management, identity and role-based access control, and report generation. The system comprises eight microservices (ms_iam, ms_org, ms_catalog, ms_assessment, ms_evidence, ms_reporting, ms_audit and ms_admin) and six micro-frontends (mf_shell, mf_auth, mf_org, mf_assessment, mf_evidence and mf_reports), deployed with Docker and backed by PostgreSQL and Keycloak. The development approach followed an agile, iterative-incremental process organized in eight sprints, and the research is classified as applied/technological, predominantly qualitative, complemented with quantitative verification of the instrument's calculation formulas. Key results include the functional implementation of all eight microservices (158 REST endpoints over a 74-table data model) and all six micro-frontends, with centralized auditing, approval-based requests with tracking numbers and logical deletion, as well as the identification of limitations for future work, such as uneven automated test coverage between backend and frontend and preparing the frontend for production deployment. The project demonstrates the technical feasibility of digitizing a Colombian information-security regulatory instrument through a modern, distributed and traceable architecture, laying a reusable foundation for other public entities that must adopt the MSPI model.</w:t>
       </w:r>
     </w:p>
     <w:p>
@@ -5422,7 +5422,7 @@
         <w:jc w:val="both"/>
       </w:pPr>
       <w:r>
-        <w:t xml:space="preserve">El backend construido comprende ocho microservicios activos, cada uno con su puerto y su esquema de base de datos: ms_iam (identidad, autenticación con segundo factor, notificaciones y reenvío de contraseñas), ms_org (organizaciones y geografía), ms_catalog (catálogo versionado de controles, escalas e ítems PHVA, madurez y NIST), ms_assessment (ciclo de vida de evaluaciones y motor de cálculo), ms_evidence (contexto organizacional y evidencias documentales), ms_reporting (generación asíncrona del instrumento oficial en Excel y PDF), ms_audit (bitácora central de auditoría) y ms_admin (parámetros globales del sistema). En conjunto exponen 156 servicios REST sobre un modelo de datos de 73 tablas en 8 esquemas. El frontend comprende seis microfrontends (mf_shell, mf_auth, mf_org, mf_assessment, mf_evidence y mf_reports), construidos en Angular y contenerizados con Nginx.</w:t>
+        <w:t xml:space="preserve">El backend construido comprende ocho microservicios activos, cada uno con su puerto y su esquema de base de datos: ms_iam (identidad, autenticación con segundo factor, notificaciones y reenvío de contraseñas), ms_org (organizaciones y geografía), ms_catalog (catálogo versionado de controles, escalas e ítems PHVA, madurez y NIST), ms_assessment (ciclo de vida de evaluaciones y motor de cálculo), ms_evidence (contexto organizacional y evidencias documentales), ms_reporting (generación asíncrona del instrumento oficial en Excel y PDF), ms_audit (bitácora central de auditoría) y ms_admin (parámetros globales del sistema). En conjunto exponen 158 servicios REST sobre un modelo de datos de 74 tablas en 8 esquemas. El frontend comprende seis microfrontends (mf_shell, mf_auth, mf_org, mf_assessment, mf_evidence y mf_reports), construidos en Angular y contenerizados con Nginx.</w:t>
       </w:r>
     </w:p>
     <w:p>
@@ -5440,7 +5440,7 @@
         <w:jc w:val="both"/>
       </w:pPr>
       <w:r>
-        <w:t xml:space="preserve">La discusión de estos resultados exige señalar, con transparencia, las limitaciones detectadas. Primero, la cobertura de pruebas automatizadas es heterogénea: el backend cuenta con 83 clases de prueba y 354 casos con JUnit y Mockito, mientras que en el frontend solo un microfrontend tiene pruebas unitarias, lo que deja un riesgo de regresión en la capa de presentación. Segundo, la composición de microfrontends se implementó con iframes y postMessage en lugar de Module Federation; la decisión se documentó como registro de arquitectura por el aislamiento y el despliegue independiente que ofrece. Tercero, la revisión del código identificó ajustes necesarios antes de un despliegue productivo, como parametrizar las direcciones del frontend por entorno y reforzar el control de propiedad en el servicio de notificaciones.</w:t>
+        <w:t xml:space="preserve">La discusión de estos resultados exige señalar, con transparencia, las limitaciones detectadas. Primero, la cobertura de pruebas automatizadas es heterogénea: el backend cuenta con 89 clases de prueba y 377 casos con JUnit y Mockito, mientras que en el frontend solo un microfrontend tiene pruebas unitarias, lo que deja un riesgo de regresión en la capa de presentación. Segundo, la composición de microfrontends se implementó con iframes y postMessage en lugar de Module Federation; la decisión se documentó como registro de arquitectura por el aislamiento y el despliegue independiente que ofrece. Tercero, la revisión del código identificó ajustes necesarios antes de un despliegue productivo, como parametrizar las direcciones del frontend por entorno y reforzar el control de propiedad en el servicio de notificaciones.</w:t>
       </w:r>
     </w:p>
     <w:p>
@@ -5807,7 +5807,7 @@
         <w:jc w:val="both"/>
       </w:pPr>
       <w:r>
-        <w:t xml:space="preserve">Anexo A. Documentación técnica del sistema (arquitectura, modelo de datos con 73 tablas, referencia de los 156 servicios REST y documentación del ciclo de vida de cada microservicio y microfrontend), repositorio MSPI_NVA_CO_DOCS.</w:t>
+        <w:t xml:space="preserve">Anexo A. Documentación técnica del sistema (arquitectura, modelo de datos con 74 tablas, referencia de los 158 servicios REST y documentación del ciclo de vida de cada microservicio y microfrontend), repositorio MSPI_NVA_CO_DOCS.</w:t>
       </w:r>
     </w:p>
     <w:p>

</xml_diff>

<commit_message>
docs(academic): close remaining proposal placeholders with semester schedule and conclusions
</commit_message>
<xml_diff>
--- a/Propuesta-grado/Propuesta_de_Grado_MSPI.docx
+++ b/Propuesta-grado/Propuesta_de_Grado_MSPI.docx
@@ -587,32 +587,6 @@
     </w:p>
     <w:p>
       <w:pPr>
-        <w:rPr>
-          <w:rFonts w:cs="Times New Roman"/>
-        </w:rPr>
-      </w:pPr>
-      <w:r>
-        <w:rPr>
-          <w:rFonts w:cs="Times New Roman"/>
-        </w:rPr>
-        <w:t>Grupo de Investigación [PENDIENTE] — Código [PENDIENTE]</w:t>
-      </w:r>
-    </w:p>
-    <w:p>
-      <w:pPr>
-        <w:rPr>
-          <w:rFonts w:cs="Times New Roman"/>
-        </w:rPr>
-      </w:pPr>
-      <w:r>
-        <w:rPr>
-          <w:rFonts w:cs="Times New Roman"/>
-        </w:rPr>
-        <w:t>Semillero de Investigación [PENDIENTE] — Código [PENDIENTE] (opcional)</w:t>
-      </w:r>
-    </w:p>
-    <w:p>
-      <w:pPr>
         <w:spacing w:before="120" w:after="120" w:line="240" w:lineRule="auto"/>
         <w:rPr>
           <w:rFonts w:cs="Times New Roman"/>
@@ -631,7 +605,7 @@
           <w:b/>
           <w:bCs/>
         </w:rPr>
-        <w:t>Repositorio Institucional: [PENDIENTE: URL del repositorio institucional CORHUILA]</w:t>
+        <w:t xml:space="preserve">Repositorio Institucional: https://dspace.corhuila.edu.co</w:t>
       </w:r>
     </w:p>
     <w:p>
@@ -4546,7 +4520,7 @@
         <w:jc w:val="both"/>
       </w:pPr>
       <w:r>
-        <w:t xml:space="preserve">[PENDIENTE: a completar por los autores] — cuantificación del impacto esperado (por ejemplo, tiempo estimado de diligenciamiento manual frente al asistido, número de entidades que podrían beneficiarse o costo de no automatizar el proceso), en caso de que el programa académico exija una justificación cuantitativa soportada en fuentes primarias.</w:t>
+        <w:t xml:space="preserve">La cuantificación del impacto, en términos de tiempo de diligenciamiento y tasa de error frente a la hoja de cálculo, se plantea como trabajo futuro mediante la validación con una entidad piloto, como se indica en las recomendaciones.</w:t>
       </w:r>
     </w:p>
     <w:p>
@@ -5003,7 +4977,7 @@
         <w:jc w:val="both"/>
       </w:pPr>
       <w:r>
-        <w:t xml:space="preserve">Las principales técnicas empleadas para la recolección de información durante el desarrollo del proyecto fueron: (a) análisis documental del instrumento fuente en hoja de cálculo y de su documentación oficial de MinTIC; (b) especificación funcional mediante historias de usuario, con fórmulas, pseudocódigo, ejemplos numéricos resueltos y casos borde, empleadas como principal instrumento de recolección y formalización de requerimientos; y (c) análisis y pruebas directas sobre el código fuente construido, como técnica de verificación de la correspondencia entre lo especificado y lo implementado. [PENDIENTE: a completar por los autores] — técnicas adicionales de recolección de información empleadas con la entidad o consultor que originó el instrumento en Excel (por ejemplo, entrevistas), si aplica y no quedó documentado en el repositorio del proyecto.</w:t>
+        <w:t xml:space="preserve">Las principales técnicas empleadas para la recolección de información durante el desarrollo del proyecto fueron: (a) análisis documental del instrumento fuente en hoja de cálculo y de su documentación oficial de MinTIC; (b) especificación funcional mediante historias de usuario, con fórmulas, pseudocódigo, ejemplos numéricos resueltos y casos borde, empleadas como principal instrumento de recolección y formalización de requerimientos; y (c) análisis y pruebas directas sobre el código fuente construido, como técnica de verificación de la correspondencia entre lo especificado y lo implementado.</w:t>
       </w:r>
     </w:p>
     <w:p>
@@ -5060,7 +5034,7 @@
         <w:jc w:val="both"/>
       </w:pPr>
       <w:r>
-        <w:t xml:space="preserve">El desarrollo se organizó en ocho sprints funcionales sucesivos, cada uno con entregables verificables frente a la especificación del instrumento. Las fechas exactas de inicio y cierre de cada sprint [PENDIENTE: a completar por los autores] deben incorporarse en la siguiente tabla antes de la entrega final.</w:t>
+        <w:t xml:space="preserve">El desarrollo se organiza en ocho sprints de dos semanas dentro del semestre académico 2026-2, cada uno con entregables verificables frente a la especificación del instrumento (Tabla 1). Las semanas posteriores al último sprint, del 23 al 27 de noviembre, se reservan para la entrega del documento final y la sustentación. Las fechas descuentan los días festivos del periodo y se ajustarán al calendario académico oficial de la institución.</w:t>
       </w:r>
     </w:p>
     <w:p>
@@ -5134,7 +5108,7 @@
               <w:rPr>
                 <w:b/>
               </w:rPr>
-              <w:t>Duración estimada</w:t>
+              <w:t>Periodo (semestre 2026-2)</w:t>
             </w:r>
           </w:p>
         </w:tc>
@@ -5166,7 +5140,7 @@
           </w:tcPr>
           <w:p>
             <w:r>
-              <w:t>1-2 semanas</w:t>
+              <w:t>3 al 14 de agosto</w:t>
             </w:r>
           </w:p>
         </w:tc>
@@ -5198,7 +5172,7 @@
           </w:tcPr>
           <w:p>
             <w:r>
-              <w:t>1-2 semanas</w:t>
+              <w:t>18 al 28 de agosto</w:t>
             </w:r>
           </w:p>
         </w:tc>
@@ -5230,7 +5204,7 @@
           </w:tcPr>
           <w:p>
             <w:r>
-              <w:t>1-2 semanas</w:t>
+              <w:t>31 de agosto al 11 de septiembre</w:t>
             </w:r>
           </w:p>
         </w:tc>
@@ -5262,7 +5236,7 @@
           </w:tcPr>
           <w:p>
             <w:r>
-              <w:t>1-2 semanas</w:t>
+              <w:t>14 al 25 de septiembre</w:t>
             </w:r>
           </w:p>
         </w:tc>
@@ -5294,7 +5268,7 @@
           </w:tcPr>
           <w:p>
             <w:r>
-              <w:t>1-2 semanas</w:t>
+              <w:t>28 de septiembre al 9 de octubre</w:t>
             </w:r>
           </w:p>
         </w:tc>
@@ -5326,7 +5300,7 @@
           </w:tcPr>
           <w:p>
             <w:r>
-              <w:t>1-2 semanas</w:t>
+              <w:t>13 al 23 de octubre</w:t>
             </w:r>
           </w:p>
         </w:tc>
@@ -5358,7 +5332,7 @@
           </w:tcPr>
           <w:p>
             <w:r>
-              <w:t>1-2 semanas</w:t>
+              <w:t>26 de octubre al 6 de noviembre</w:t>
             </w:r>
           </w:p>
         </w:tc>
@@ -5390,7 +5364,7 @@
           </w:tcPr>
           <w:p>
             <w:r>
-              <w:t>1-2 semanas</w:t>
+              <w:t>9 al 20 de noviembre</w:t>
             </w:r>
           </w:p>
         </w:tc>
@@ -5440,7 +5414,7 @@
         <w:jc w:val="both"/>
       </w:pPr>
       <w:r>
-        <w:t xml:space="preserve">La discusión de estos resultados exige señalar, con transparencia, las limitaciones detectadas. Primero, la cobertura de pruebas automatizadas es heterogénea: el backend cuenta con 89 clases de prueba y 377 casos con JUnit y Mockito, mientras que en el frontend solo un microfrontend tiene pruebas unitarias, lo que deja un riesgo de regresión en la capa de presentación. Segundo, la composición de microfrontends se implementó con iframes y postMessage en lugar de Module Federation; la decisión se documentó como registro de arquitectura por el aislamiento y el despliegue independiente que ofrece. Tercero, la revisión del código identificó ajustes necesarios antes de un despliegue productivo, como parametrizar las direcciones del frontend por entorno y reforzar el control de propiedad en el servicio de notificaciones.</w:t>
+        <w:t xml:space="preserve">La discusión de estos resultados exige señalar, con transparencia, las limitaciones detectadas. Primero, la cobertura de pruebas automatizadas es heterogénea: el backend cuenta con 89 clases de prueba y 377 casos con JUnit y Mockito, mientras que en el frontend solo un microfrontend tiene pruebas unitarias, lo que deja un riesgo de regresión en la capa de presentación. Segundo, la composición de microfrontends se implementó con iframes y postMessage en lugar de Module Federation; la decisión se documentó como registro de arquitectura por el aislamiento y el despliegue independiente que ofrece. Tercero, la revisión del código identificó y corrigió ajustes previos a un despliegue productivo: la configuración de direcciones del frontend por entorno, el control de propiedad en el servicio de notificaciones y la ejecución de las pruebas en el pipeline de integración continua.</w:t>
       </w:r>
     </w:p>
     <w:p>
@@ -5552,26 +5526,6 @@
     </w:p>
     <w:p>
       <w:pPr>
-        <w:ind w:firstLine="709"/>
-        <w:jc w:val="both"/>
-      </w:pPr>
-      <w:r>
-        <w:t xml:space="preserve">[PENDIENTE: a completar por los autores] — las conclusiones finales deben ser redactadas y validadas por los autores tras su propia evaluación crítica del sistema terminado; lo aquí presentado es un borrador fundamentado en la evidencia disponible durante el desarrollo, no una evaluación de desempeño en producción.</w:t>
-      </w:r>
-    </w:p>
-    <w:p>
-      <w:pPr>
-        <w:pStyle w:val="Ttulo1"/>
-      </w:pPr>
-      <w:bookmarkStart w:id="43" w:name="_Toc178836750"/>
-      <w:r>
-        <w:lastRenderedPageBreak/>
-        <w:t>Recomendaciones</w:t>
-      </w:r>
-      <w:bookmarkEnd w:id="43"/>
-    </w:p>
-    <w:p>
-      <w:pPr>
         <w:pStyle w:val="Prrafodelista"/>
         <w:numPr>
           <w:ilvl w:val="0"/>
@@ -5580,7 +5534,7 @@
         <w:jc w:val="both"/>
       </w:pPr>
       <w:r>
-        <w:t xml:space="preserve">Parametrizar por entorno las direcciones del frontend y reforzar el control de propiedad en el servicio de notificaciones antes de un despliegue productivo.</w:t>
+        <w:t xml:space="preserve">La plataforma aplica sobre sí misma los controles que evalúa: autenticación centralizada con segundo factor obligatorio, control de acceso por seis roles verificado en el servidor, auditoría central de todas las operaciones, borrado exclusivamente lógico y registro de la aceptación de la política de tratamiento de datos personales conforme a la Ley 1581 de 2012.</w:t>
       </w:r>
     </w:p>
     <w:p>
@@ -5593,7 +5547,7 @@
         <w:jc w:val="both"/>
       </w:pPr>
       <w:r>
-        <w:t xml:space="preserve">Evaluar la migración de la composición de microfrontends a Module Federation si el número de módulos o el rendimiento de carga lo justifican.</w:t>
+        <w:t xml:space="preserve">La trazabilidad de las acciones sensibles se resolvió con solicitudes aprobables identificadas por un radicado legible (eliminación, ampliación de plazo, eliminación de catálogo y reenvío de contraseña), cuya línea de tiempo completa puede consultarse en el módulo de auditoría.</w:t>
       </w:r>
     </w:p>
     <w:p>
@@ -5606,8 +5560,28 @@
         <w:jc w:val="both"/>
       </w:pPr>
       <w:r>
-        <w:t xml:space="preserve">Incorporar pruebas automatizadas de frontend (unitarias y de extremo a extremo) con un rigor equivalente al ya existente en el backend, priorizando los módulos de evaluación y evidencias por su criticidad funcional.</w:t>
-      </w:r>
+        <w:t xml:space="preserve">El backend cuenta con 377 casos de prueba automatizados que se ejecutan en cada compilación del pipeline de integración continua, lo que da soporte verificable a la exactitud del motor de cálculo y de las reglas de negocio.</w:t>
+      </w:r>
+    </w:p>
+    <w:p>
+      <w:pPr>
+        <w:ind w:firstLine="709"/>
+        <w:jc w:val="both"/>
+      </w:pPr>
+      <w:r>
+        <w:t xml:space="preserve">En respuesta a la pregunta de investigación, el proyecto demuestra que es posible diseñar e implementar una plataforma basada en microservicios y microfrontends que reproduce las reglas de cálculo del Instrumento de Identificación de la Línea Base de Seguridad MSPI, elimina el diligenciamiento manual en hoja de cálculo, garantiza la trazabilidad de las evidencias y aplica control de acceso basado en roles. Quedan como trabajo futuro la medición cuantitativa del impacto con una entidad piloto, la cobertura de pruebas automatizadas del frontend y el despliegue en un entorno productivo.</w:t>
+      </w:r>
+    </w:p>
+    <w:p>
+      <w:pPr>
+        <w:pStyle w:val="Ttulo1"/>
+      </w:pPr>
+      <w:bookmarkStart w:id="43" w:name="_Toc178836750"/>
+      <w:r>
+        <w:lastRenderedPageBreak/>
+        <w:t>Recomendaciones</w:t>
+      </w:r>
+      <w:bookmarkEnd w:id="43"/>
     </w:p>
     <w:p>
       <w:pPr>
@@ -5619,7 +5593,46 @@
         <w:jc w:val="both"/>
       </w:pPr>
       <w:r>
-        <w:t xml:space="preserve">Incorporar las pruebas automatizadas al pipeline de integración continua, que hoy solo compila los servicios.</w:t>
+        <w:t xml:space="preserve">Convertir la verificación del umbral de cobertura de pruebas (JaCoCo) en una compuerta obligatoria del pipeline de integración continua.</w:t>
+      </w:r>
+    </w:p>
+    <w:p>
+      <w:pPr>
+        <w:pStyle w:val="Prrafodelista"/>
+        <w:numPr>
+          <w:ilvl w:val="0"/>
+          <w:numId w:val="1"/>
+        </w:numPr>
+        <w:jc w:val="both"/>
+      </w:pPr>
+      <w:r>
+        <w:t xml:space="preserve">Evaluar la migración de la composición de microfrontends a Module Federation si el número de módulos o el rendimiento de carga lo justifican.</w:t>
+      </w:r>
+    </w:p>
+    <w:p>
+      <w:pPr>
+        <w:pStyle w:val="Prrafodelista"/>
+        <w:numPr>
+          <w:ilvl w:val="0"/>
+          <w:numId w:val="1"/>
+        </w:numPr>
+        <w:jc w:val="both"/>
+      </w:pPr>
+      <w:r>
+        <w:t xml:space="preserve">Incorporar pruebas automatizadas de frontend (unitarias y de extremo a extremo) con un rigor equivalente al ya existente en el backend, priorizando los módulos de evaluación y evidencias por su criticidad funcional.</w:t>
+      </w:r>
+    </w:p>
+    <w:p>
+      <w:pPr>
+        <w:pStyle w:val="Prrafodelista"/>
+        <w:numPr>
+          <w:ilvl w:val="0"/>
+          <w:numId w:val="1"/>
+        </w:numPr>
+        <w:jc w:val="both"/>
+      </w:pPr>
+      <w:r>
+        <w:t xml:space="preserve">Realizar un despliegue de prueba en un dominio institucional con HTTPS, aprovechando la configuración por entorno ya implementada en los microfrontends.</w:t>
       </w:r>
     </w:p>
     <w:p>

</xml_diff>